<commit_message>
#260115 fix: fixed global settings
</commit_message>
<xml_diff>
--- a/files/ihtar-ticari.docx
+++ b/files/ihtar-ticari.docx
@@ -349,10 +349,6 @@
       <w:pPr>
         <w:pStyle w:val="Normal2"/>
         <w:jc w:val="both"/>
-        <w:rPr>
-          <w:sz w:val="24"/>
-          <w:szCs w:val="24"/>
-        </w:rPr>
       </w:pPr>
       <w:r>
         <w:rPr>
@@ -367,150 +363,50 @@
           <w:sz w:val="24"/>
           <w:szCs w:val="24"/>
         </w:rPr>
-        <w:t xml:space="preserve">Malumunuz olduğu üzere şirketimiz ile sizin aranızda, </w:t>
-      </w:r>
-      <w:r>
-        <w:rPr>
-          <w:noProof/>
-          <w:sz w:val="24"/>
-          <w:szCs w:val="24"/>
-        </w:rPr>
-        <w:t>…………..</w:t>
-      </w:r>
-      <w:r>
-        <w:rPr>
-          <w:sz w:val="24"/>
-          <w:szCs w:val="24"/>
-        </w:rPr>
-        <w:t xml:space="preserve"> </w:t>
-      </w:r>
-      <w:proofErr w:type="gramStart"/>
-      <w:r>
-        <w:rPr>
-          <w:sz w:val="24"/>
-          <w:szCs w:val="24"/>
-        </w:rPr>
-        <w:t>tarih</w:t>
-      </w:r>
-      <w:proofErr w:type="gramEnd"/>
-      <w:r>
-        <w:rPr>
-          <w:sz w:val="24"/>
-          <w:szCs w:val="24"/>
-        </w:rPr>
-        <w:t xml:space="preserve"> ve </w:t>
-      </w:r>
-      <w:r>
-        <w:rPr>
-          <w:noProof/>
-          <w:sz w:val="24"/>
-          <w:szCs w:val="24"/>
-        </w:rPr>
-        <w:t>………….</w:t>
-      </w:r>
-      <w:r>
-        <w:rPr>
-          <w:sz w:val="24"/>
-          <w:szCs w:val="24"/>
-        </w:rPr>
-        <w:t xml:space="preserve"> </w:t>
-      </w:r>
-      <w:proofErr w:type="gramStart"/>
-      <w:r>
-        <w:rPr>
-          <w:sz w:val="24"/>
-          <w:szCs w:val="24"/>
-        </w:rPr>
-        <w:t>numaralı</w:t>
-      </w:r>
-      <w:proofErr w:type="gramEnd"/>
-      <w:r>
-        <w:rPr>
-          <w:sz w:val="24"/>
-          <w:szCs w:val="24"/>
-        </w:rPr>
-        <w:t xml:space="preserve"> ve konusu </w:t>
-      </w:r>
-      <w:proofErr w:type="gramStart"/>
-      <w:r>
-        <w:rPr>
-          <w:sz w:val="24"/>
-          <w:szCs w:val="24"/>
-        </w:rPr>
-        <w:t>…….</w:t>
-      </w:r>
-      <w:proofErr w:type="gramEnd"/>
-      <w:r>
-        <w:rPr>
-          <w:sz w:val="24"/>
-          <w:szCs w:val="24"/>
-        </w:rPr>
-        <w:t>.</w:t>
-      </w:r>
-      <w:proofErr w:type="gramStart"/>
-      <w:r>
-        <w:rPr>
-          <w:sz w:val="24"/>
-          <w:szCs w:val="24"/>
-        </w:rPr>
-        <w:t>ili,…</w:t>
-      </w:r>
-      <w:proofErr w:type="gramEnd"/>
-      <w:r>
-        <w:rPr>
-          <w:sz w:val="24"/>
-          <w:szCs w:val="24"/>
-        </w:rPr>
-        <w:t>…</w:t>
-      </w:r>
-      <w:proofErr w:type="gramStart"/>
-      <w:r>
-        <w:rPr>
-          <w:sz w:val="24"/>
-          <w:szCs w:val="24"/>
-        </w:rPr>
-        <w:t>.,ilçesi,…..ada,…..parsel,…</w:t>
-      </w:r>
-      <w:proofErr w:type="gramEnd"/>
-      <w:r>
-        <w:rPr>
-          <w:sz w:val="24"/>
-          <w:szCs w:val="24"/>
-        </w:rPr>
-        <w:t>…</w:t>
-      </w:r>
-      <w:proofErr w:type="gramStart"/>
-      <w:r>
-        <w:rPr>
-          <w:sz w:val="24"/>
-          <w:szCs w:val="24"/>
-        </w:rPr>
-        <w:t>blok,…</w:t>
-      </w:r>
-      <w:proofErr w:type="gramEnd"/>
-      <w:r>
-        <w:rPr>
-          <w:sz w:val="24"/>
-          <w:szCs w:val="24"/>
-        </w:rPr>
-        <w:t xml:space="preserve">…numaralı bağımsız bölüm olan </w:t>
-      </w:r>
-      <w:proofErr w:type="gramStart"/>
-      <w:r>
-        <w:rPr>
-          <w:sz w:val="24"/>
-          <w:szCs w:val="24"/>
-        </w:rPr>
-        <w:t>bir  finansal</w:t>
-      </w:r>
-      <w:proofErr w:type="gramEnd"/>
-      <w:r>
-        <w:rPr>
-          <w:sz w:val="24"/>
-          <w:szCs w:val="24"/>
-        </w:rPr>
-        <w:t xml:space="preserve"> kiralama sözleşmesi imzalamışlardır.</w:t>
-      </w:r>
+        <w:t>Malumunuz olduğu üzere şirketimiz ile sizin aranızda,</w:t>
+      </w:r>
+      <w:r>
+        <w:rPr>
+          <w:sz w:val="24"/>
+          <w:szCs w:val="24"/>
+        </w:rPr>
+        <w:t xml:space="preserve"> {{</w:t>
+      </w:r>
+      <w:proofErr w:type="spellStart"/>
+      <w:r>
+        <w:rPr>
+          <w:sz w:val="24"/>
+          <w:szCs w:val="24"/>
+        </w:rPr>
+        <w:t>sozlesme_tarih</w:t>
+      </w:r>
+      <w:proofErr w:type="spellEnd"/>
+      <w:r>
+        <w:rPr>
+          <w:sz w:val="24"/>
+          <w:szCs w:val="24"/>
+        </w:rPr>
+        <w:t>}}</w:t>
+      </w:r>
+      <w:r>
+        <w:rPr>
+          <w:sz w:val="24"/>
+          <w:szCs w:val="24"/>
+        </w:rPr>
+        <w:t xml:space="preserve"> tarih ve</w:t>
+      </w:r>
+      <w:r>
+        <w:rPr>
+          <w:sz w:val="24"/>
+          <w:szCs w:val="24"/>
+        </w:rPr>
+        <w:t xml:space="preserve"> {{</w:t>
+      </w:r>
+      <w:proofErr w:type="spellStart"/>
+      <w:r>
+        <w:t>sozlesme_no</w:t>
+      </w:r>
+      <w:proofErr w:type="spellEnd"/>
     </w:p>
     <w:p>
       <w:pPr>
@@ -521,6 +417,100 @@
           <w:szCs w:val="24"/>
         </w:rPr>
       </w:pPr>
+      <w:r>
+        <w:rPr>
+          <w:sz w:val="24"/>
+          <w:szCs w:val="24"/>
+        </w:rPr>
+        <w:t>}}</w:t>
+      </w:r>
+      <w:r>
+        <w:rPr>
+          <w:sz w:val="24"/>
+          <w:szCs w:val="24"/>
+        </w:rPr>
+        <w:t xml:space="preserve"> numaralı ve konusu </w:t>
+      </w:r>
+      <w:proofErr w:type="gramStart"/>
+      <w:r>
+        <w:rPr>
+          <w:sz w:val="24"/>
+          <w:szCs w:val="24"/>
+        </w:rPr>
+        <w:t>…….</w:t>
+      </w:r>
+      <w:proofErr w:type="gramEnd"/>
+      <w:r>
+        <w:rPr>
+          <w:sz w:val="24"/>
+          <w:szCs w:val="24"/>
+        </w:rPr>
+        <w:t>.</w:t>
+      </w:r>
+      <w:proofErr w:type="gramStart"/>
+      <w:r>
+        <w:rPr>
+          <w:sz w:val="24"/>
+          <w:szCs w:val="24"/>
+        </w:rPr>
+        <w:t>ili,…</w:t>
+      </w:r>
+      <w:proofErr w:type="gramEnd"/>
+      <w:r>
+        <w:rPr>
+          <w:sz w:val="24"/>
+          <w:szCs w:val="24"/>
+        </w:rPr>
+        <w:t>…</w:t>
+      </w:r>
+      <w:proofErr w:type="gramStart"/>
+      <w:r>
+        <w:rPr>
+          <w:sz w:val="24"/>
+          <w:szCs w:val="24"/>
+        </w:rPr>
+        <w:t>.,ilçesi,…..ada,…..parsel,…</w:t>
+      </w:r>
+      <w:proofErr w:type="gramEnd"/>
+      <w:r>
+        <w:rPr>
+          <w:sz w:val="24"/>
+          <w:szCs w:val="24"/>
+        </w:rPr>
+        <w:t>…</w:t>
+      </w:r>
+      <w:proofErr w:type="gramStart"/>
+      <w:r>
+        <w:rPr>
+          <w:sz w:val="24"/>
+          <w:szCs w:val="24"/>
+        </w:rPr>
+        <w:t>blok,…</w:t>
+      </w:r>
+      <w:proofErr w:type="gramEnd"/>
+      <w:r>
+        <w:rPr>
+          <w:sz w:val="24"/>
+          <w:szCs w:val="24"/>
+        </w:rPr>
+        <w:t xml:space="preserve">…numaralı bağımsız bölüm olan </w:t>
+      </w:r>
+      <w:proofErr w:type="gramStart"/>
+      <w:r>
+        <w:rPr>
+          <w:sz w:val="24"/>
+          <w:szCs w:val="24"/>
+        </w:rPr>
+        <w:t>bir  finansal</w:t>
+      </w:r>
+      <w:proofErr w:type="gramEnd"/>
+      <w:r>
+        <w:rPr>
+          <w:sz w:val="24"/>
+          <w:szCs w:val="24"/>
+        </w:rPr>
+        <w:t xml:space="preserve"> kiralama sözleşmesi imzalamışlardır.</w:t>
+      </w:r>
     </w:p>
     <w:p>
       <w:pPr>
@@ -531,6 +521,15 @@
           <w:szCs w:val="24"/>
         </w:rPr>
       </w:pPr>
+    </w:p>
+    <w:p>
+      <w:pPr>
+        <w:pStyle w:val="Normal2"/>
+        <w:jc w:val="both"/>
+        <w:rPr>
+          <w:bCs/>
+        </w:rPr>
+      </w:pPr>
       <w:r>
         <w:rPr>
           <w:b/>
@@ -571,7 +570,15 @@
           <w:sz w:val="24"/>
           <w:szCs w:val="24"/>
         </w:rPr>
-        <w:t xml:space="preserve"> tutarların tarafınızca ödemeyerek temerrüde düştüğünüz tespit edilmiştir. ………….. </w:t>
+        <w:t xml:space="preserve"> tutarların tarafınızca ödemeyerek temerrüde düştüğünüz tespit edilmiştir.</w:t>
+      </w:r>
+      <w:r>
+        <w:rPr>
+          <w:bCs/>
+          <w:sz w:val="24"/>
+          <w:szCs w:val="24"/>
+        </w:rPr>
+        <w:t xml:space="preserve"> </w:t>
       </w:r>
       <w:proofErr w:type="gramStart"/>
       <w:r>
@@ -580,7 +587,21 @@
           <w:sz w:val="24"/>
           <w:szCs w:val="24"/>
         </w:rPr>
-        <w:t>tarihi</w:t>
+        <w:t>{{</w:t>
+      </w:r>
+      <w:r>
+        <w:rPr>
+          <w:sz w:val="24"/>
+          <w:szCs w:val="24"/>
+        </w:rPr>
+        <w:t xml:space="preserve"> </w:t>
+      </w:r>
+      <w:r>
+        <w:rPr>
+          <w:sz w:val="24"/>
+          <w:szCs w:val="24"/>
+        </w:rPr>
+        <w:t>tarih</w:t>
       </w:r>
       <w:proofErr w:type="gramEnd"/>
       <w:r>
@@ -589,7 +610,15 @@
           <w:sz w:val="24"/>
           <w:szCs w:val="24"/>
         </w:rPr>
-        <w:t xml:space="preserve"> itibariyle aşağıda borç dökümü yapılan tabloda görüldüğü üzere </w:t>
+        <w:t xml:space="preserve"> }} </w:t>
+      </w:r>
+      <w:r>
+        <w:rPr>
+          <w:bCs/>
+          <w:sz w:val="24"/>
+          <w:szCs w:val="24"/>
+        </w:rPr>
+        <w:t xml:space="preserve">tarihi itibariyle aşağıda borç dökümü yapılan tabloda görüldüğü üzere </w:t>
       </w:r>
       <w:proofErr w:type="gramStart"/>
       <w:r>
@@ -607,7 +636,31 @@
           <w:sz w:val="24"/>
           <w:szCs w:val="24"/>
         </w:rPr>
-        <w:t xml:space="preserve"> ………………</w:t>
+        <w:t xml:space="preserve"> {{</w:t>
+      </w:r>
+      <w:proofErr w:type="spellStart"/>
+      <w:r>
+        <w:rPr>
+          <w:bCs/>
+        </w:rPr>
+        <w:t>gecikme_bakiye</w:t>
+      </w:r>
+      <w:proofErr w:type="spellEnd"/>
+      <w:r>
+        <w:rPr>
+          <w:bCs/>
+          <w:sz w:val="24"/>
+          <w:szCs w:val="24"/>
+        </w:rPr>
+        <w:t>}}</w:t>
+      </w:r>
+      <w:r>
+        <w:rPr>
+          <w:bCs/>
+          <w:sz w:val="24"/>
+          <w:szCs w:val="24"/>
+        </w:rPr>
+        <w:t xml:space="preserve"> </w:t>
       </w:r>
       <w:r>
         <w:rPr>
@@ -624,7 +677,39 @@
           <w:sz w:val="24"/>
           <w:szCs w:val="24"/>
         </w:rPr>
-        <w:t xml:space="preserve">kira bedeli borcunuz bulunmaktadır. Yine sözleşme gereği müvekkil şirkete ödemeniz gereken </w:t>
+        <w:t>kira bedeli borcunuz bulunmaktadır. Yine sözleşme gereği müvekkil şirkete ödemeniz gereken</w:t>
+      </w:r>
+      <w:r>
+        <w:rPr>
+          <w:bCs/>
+          <w:sz w:val="24"/>
+          <w:szCs w:val="24"/>
+        </w:rPr>
+        <w:t xml:space="preserve"> {{</w:t>
+      </w:r>
+      <w:proofErr w:type="spellStart"/>
+      <w:r>
+        <w:rPr>
+          <w:bCs/>
+        </w:rPr>
+        <w:t>masraf_bakiye</w:t>
+      </w:r>
+      <w:proofErr w:type="spellEnd"/>
+      <w:r>
+        <w:rPr>
+          <w:bCs/>
+          <w:sz w:val="24"/>
+          <w:szCs w:val="24"/>
+        </w:rPr>
+        <w:t>}}</w:t>
+      </w:r>
+      <w:r>
+        <w:rPr>
+          <w:bCs/>
+          <w:sz w:val="24"/>
+          <w:szCs w:val="24"/>
+        </w:rPr>
+        <w:t xml:space="preserve"> TL masraf ve temerrüdünüz nedeniyle tahakkuk eden …</w:t>
       </w:r>
       <w:proofErr w:type="gramStart"/>
       <w:r>
@@ -642,7 +727,7 @@
           <w:sz w:val="24"/>
           <w:szCs w:val="24"/>
         </w:rPr>
-        <w:t>TL masraf ve temerrüdünüz nedeniyle tahakkuk eden …</w:t>
+        <w:t xml:space="preserve">.TL avukatlık ücreti borcunuzla birlikte </w:t>
       </w:r>
       <w:proofErr w:type="gramStart"/>
       <w:r>
@@ -651,7 +736,7 @@
           <w:sz w:val="24"/>
           <w:szCs w:val="24"/>
         </w:rPr>
-        <w:t>…….</w:t>
+        <w:t>toplamda :</w:t>
       </w:r>
       <w:proofErr w:type="gramEnd"/>
       <w:r>
@@ -660,43 +745,33 @@
           <w:sz w:val="24"/>
           <w:szCs w:val="24"/>
         </w:rPr>
-        <w:t xml:space="preserve">.TL avukatlık ücreti borcunuzla birlikte </w:t>
-      </w:r>
-      <w:proofErr w:type="gramStart"/>
-      <w:r>
-        <w:rPr>
-          <w:bCs/>
-          <w:sz w:val="24"/>
-          <w:szCs w:val="24"/>
-        </w:rPr>
-        <w:t>toplamda :</w:t>
-      </w:r>
-      <w:proofErr w:type="gramEnd"/>
-      <w:r>
-        <w:rPr>
-          <w:bCs/>
-          <w:sz w:val="24"/>
-          <w:szCs w:val="24"/>
-        </w:rPr>
-        <w:t xml:space="preserve"> …</w:t>
-      </w:r>
-      <w:proofErr w:type="gramStart"/>
-      <w:r>
-        <w:rPr>
-          <w:bCs/>
-          <w:sz w:val="24"/>
-          <w:szCs w:val="24"/>
-        </w:rPr>
-        <w:t>…….</w:t>
-      </w:r>
-      <w:proofErr w:type="gramEnd"/>
-      <w:r>
-        <w:rPr>
-          <w:bCs/>
-          <w:sz w:val="24"/>
-          <w:szCs w:val="24"/>
-        </w:rPr>
-        <w:t>.</w:t>
+        <w:t xml:space="preserve"> {{</w:t>
+      </w:r>
+      <w:proofErr w:type="spellStart"/>
+      <w:r>
+        <w:rPr>
+          <w:bCs/>
+          <w:sz w:val="24"/>
+          <w:szCs w:val="24"/>
+        </w:rPr>
+        <w:t>toplam_bakiye</w:t>
+      </w:r>
+      <w:proofErr w:type="spellEnd"/>
+      <w:r>
+        <w:rPr>
+          <w:bCs/>
+          <w:sz w:val="24"/>
+          <w:szCs w:val="24"/>
+        </w:rPr>
+        <w:t>}}</w:t>
+      </w:r>
+      <w:r>
+        <w:rPr>
+          <w:bCs/>
+          <w:sz w:val="24"/>
+          <w:szCs w:val="24"/>
+        </w:rPr>
+        <w:t xml:space="preserve"> </w:t>
       </w:r>
       <w:proofErr w:type="gramStart"/>
       <w:r>
@@ -2290,7 +2365,6 @@
   <w:style w:type="character" w:default="1" w:styleId="VarsaylanParagrafYazTipi">
     <w:name w:val="Default Paragraph Font"/>
     <w:uiPriority w:val="1"/>
-    <w:semiHidden/>
     <w:unhideWhenUsed/>
   </w:style>
   <w:style w:type="table" w:default="1" w:styleId="NormalTablo">

</xml_diff>

<commit_message>
#260121 fix: fixed global settings
</commit_message>
<xml_diff>
--- a/files/ihtar-ticari.docx
+++ b/files/ihtar-ticari.docx
@@ -69,6 +69,7 @@
         </w:rPr>
         <w:t>KEŞİDECİ</w:t>
       </w:r>
+      <w:proofErr w:type="gramStart"/>
       <w:r>
         <w:rPr>
           <w:b/>
@@ -93,7 +94,16 @@
           <w:sz w:val="24"/>
           <w:szCs w:val="24"/>
         </w:rPr>
-        <w:t>ARI FİNANSAL KİRALAMA A.Ş.</w:t>
+        <w:t>ARI</w:t>
+      </w:r>
+      <w:proofErr w:type="gramEnd"/>
+      <w:r>
+        <w:rPr>
+          <w:b/>
+          <w:sz w:val="24"/>
+          <w:szCs w:val="24"/>
+        </w:rPr>
+        <w:t xml:space="preserve"> FİNANSAL KİRALAMA A.Ş.</w:t>
       </w:r>
       <w:r>
         <w:rPr>
@@ -111,17 +121,18 @@
         <w:autoSpaceDN w:val="0"/>
         <w:adjustRightInd w:val="0"/>
         <w:spacing w:line="199" w:lineRule="atLeast"/>
-        <w:rPr>
-          <w:sz w:val="24"/>
-          <w:szCs w:val="24"/>
-        </w:rPr>
-      </w:pPr>
-      <w:r>
-        <w:rPr>
-          <w:sz w:val="24"/>
-          <w:szCs w:val="24"/>
-        </w:rPr>
-        <w:t xml:space="preserve">                                 </w:t>
+        <w:ind w:left="1600"/>
+        <w:rPr>
+          <w:sz w:val="24"/>
+          <w:szCs w:val="24"/>
+        </w:rPr>
+      </w:pPr>
+      <w:r>
+        <w:rPr>
+          <w:sz w:val="24"/>
+          <w:szCs w:val="24"/>
+        </w:rPr>
+        <w:t>SULTANTEPE MAH. HÜSEYİN BAYKARA SK. NO: 1 İÇ KAPI NO: 3 ÜSKÜDAR/İSTANBUL</w:t>
       </w:r>
     </w:p>
     <w:p>
@@ -142,6 +153,7 @@
           <w:szCs w:val="24"/>
         </w:rPr>
       </w:pPr>
+      <w:proofErr w:type="gramStart"/>
       <w:r>
         <w:rPr>
           <w:b/>
@@ -173,7 +185,15 @@
           <w:sz w:val="24"/>
           <w:szCs w:val="24"/>
         </w:rPr>
-        <w:t>{{</w:t>
+        <w:t>{</w:t>
+      </w:r>
+      <w:proofErr w:type="gramEnd"/>
+      <w:r>
+        <w:rPr>
+          <w:sz w:val="24"/>
+          <w:szCs w:val="24"/>
+        </w:rPr>
+        <w:t>{</w:t>
       </w:r>
       <w:r>
         <w:rPr>
@@ -272,6 +292,7 @@
         </w:rPr>
         <w:t>KONUSU </w:t>
       </w:r>
+      <w:proofErr w:type="gramStart"/>
       <w:r>
         <w:rPr>
           <w:b/>
@@ -282,16 +303,40 @@
         <w:tab/>
         <w:t xml:space="preserve">:  </w:t>
       </w:r>
-      <w:r>
-        <w:rPr>
-          <w:b/>
-          <w:bCs/>
-          <w:sz w:val="24"/>
-          <w:szCs w:val="24"/>
-        </w:rPr>
-        <w:t>İhtarname içerir</w:t>
-      </w:r>
-    </w:p>
+      <w:bookmarkStart w:id="0" w:name="_Hlk219886425"/>
+      <w:r>
+        <w:rPr>
+          <w:sz w:val="24"/>
+          <w:szCs w:val="24"/>
+        </w:rPr>
+        <w:t>Şirketimiz</w:t>
+      </w:r>
+      <w:proofErr w:type="gramEnd"/>
+      <w:r>
+        <w:rPr>
+          <w:sz w:val="24"/>
+          <w:szCs w:val="24"/>
+        </w:rPr>
+        <w:t xml:space="preserve"> ile muhatap arasında imzalanan finansal kiralama sözleşmesinden kaynaklı alacakların tahsili, sözleşmenin </w:t>
+      </w:r>
+      <w:proofErr w:type="gramStart"/>
+      <w:r>
+        <w:rPr>
+          <w:sz w:val="24"/>
+          <w:szCs w:val="24"/>
+        </w:rPr>
+        <w:t>fesih edileceği</w:t>
+      </w:r>
+      <w:proofErr w:type="gramEnd"/>
+      <w:r>
+        <w:rPr>
+          <w:sz w:val="24"/>
+          <w:szCs w:val="24"/>
+        </w:rPr>
+        <w:t xml:space="preserve"> ihtarıdır.</w:t>
+      </w:r>
+    </w:p>
+    <w:bookmarkEnd w:id="0"/>
     <w:p>
       <w:pPr>
         <w:pStyle w:val="Normal2"/>
@@ -343,7 +388,7 @@
         <w:pStyle w:val="Normal2"/>
         <w:jc w:val="both"/>
       </w:pPr>
-      <w:bookmarkStart w:id="0" w:name="_Hlk68862260"/>
+      <w:bookmarkStart w:id="1" w:name="_Hlk68862260"/>
       <w:r>
         <w:rPr>
           <w:b/>
@@ -431,7 +476,87 @@
           <w:sz w:val="24"/>
           <w:szCs w:val="24"/>
         </w:rPr>
-        <w:t>{{il}}{{ilce}}{{ada}}{{parsel}}{{blok}}{{</w:t>
+        <w:t>{{il</w:t>
+      </w:r>
+      <w:proofErr w:type="gramStart"/>
+      <w:r>
+        <w:rPr>
+          <w:sz w:val="24"/>
+          <w:szCs w:val="24"/>
+        </w:rPr>
+        <w:t>}}{</w:t>
+      </w:r>
+      <w:proofErr w:type="gramEnd"/>
+      <w:r>
+        <w:rPr>
+          <w:sz w:val="24"/>
+          <w:szCs w:val="24"/>
+        </w:rPr>
+        <w:t>{ilce</w:t>
+      </w:r>
+      <w:proofErr w:type="gramStart"/>
+      <w:r>
+        <w:rPr>
+          <w:sz w:val="24"/>
+          <w:szCs w:val="24"/>
+        </w:rPr>
+        <w:t>}}{</w:t>
+      </w:r>
+      <w:proofErr w:type="gramEnd"/>
+      <w:r>
+        <w:rPr>
+          <w:sz w:val="24"/>
+          <w:szCs w:val="24"/>
+        </w:rPr>
+        <w:t>{ada</w:t>
+      </w:r>
+      <w:proofErr w:type="gramStart"/>
+      <w:r>
+        <w:rPr>
+          <w:sz w:val="24"/>
+          <w:szCs w:val="24"/>
+        </w:rPr>
+        <w:t>}}{</w:t>
+      </w:r>
+      <w:proofErr w:type="gramEnd"/>
+      <w:r>
+        <w:rPr>
+          <w:sz w:val="24"/>
+          <w:szCs w:val="24"/>
+        </w:rPr>
+        <w:t>{parsel</w:t>
+      </w:r>
+      <w:proofErr w:type="gramStart"/>
+      <w:r>
+        <w:rPr>
+          <w:sz w:val="24"/>
+          <w:szCs w:val="24"/>
+        </w:rPr>
+        <w:t>}}{</w:t>
+      </w:r>
+      <w:proofErr w:type="gramEnd"/>
+      <w:r>
+        <w:rPr>
+          <w:sz w:val="24"/>
+          <w:szCs w:val="24"/>
+        </w:rPr>
+        <w:t>{blok</w:t>
+      </w:r>
+      <w:proofErr w:type="gramStart"/>
+      <w:r>
+        <w:rPr>
+          <w:sz w:val="24"/>
+          <w:szCs w:val="24"/>
+        </w:rPr>
+        <w:t>}}{</w:t>
+      </w:r>
+      <w:proofErr w:type="gramEnd"/>
+      <w:r>
+        <w:rPr>
+          <w:sz w:val="24"/>
+          <w:szCs w:val="24"/>
+        </w:rPr>
+        <w:t>{</w:t>
       </w:r>
       <w:proofErr w:type="spellStart"/>
       <w:r>
@@ -439,7 +564,15 @@
           <w:sz w:val="24"/>
           <w:szCs w:val="24"/>
         </w:rPr>
-        <w:t>bagimsiz_bolum</w:t>
+        <w:t>bagimsiz_</w:t>
+      </w:r>
+      <w:proofErr w:type="gramStart"/>
+      <w:r>
+        <w:rPr>
+          <w:sz w:val="24"/>
+          <w:szCs w:val="24"/>
+        </w:rPr>
+        <w:t>bolum</w:t>
       </w:r>
       <w:proofErr w:type="spellEnd"/>
       <w:r>
@@ -454,9 +587,33 @@
           <w:sz w:val="24"/>
           <w:szCs w:val="24"/>
         </w:rPr>
-        <w:t>olan bir  finansal kiralama sözleşmesi imzalamışlardır.</w:t>
-      </w:r>
-      <w:bookmarkEnd w:id="0"/>
+        <w:t>olan</w:t>
+      </w:r>
+      <w:proofErr w:type="gramEnd"/>
+      <w:r>
+        <w:rPr>
+          <w:sz w:val="24"/>
+          <w:szCs w:val="24"/>
+        </w:rPr>
+        <w:t xml:space="preserve"> </w:t>
+      </w:r>
+      <w:proofErr w:type="gramStart"/>
+      <w:r>
+        <w:rPr>
+          <w:sz w:val="24"/>
+          <w:szCs w:val="24"/>
+        </w:rPr>
+        <w:t>bir  finansal</w:t>
+      </w:r>
+      <w:proofErr w:type="gramEnd"/>
+      <w:r>
+        <w:rPr>
+          <w:sz w:val="24"/>
+          <w:szCs w:val="24"/>
+        </w:rPr>
+        <w:t xml:space="preserve"> kiralama sözleşmesi imzalamışlardır.</w:t>
+      </w:r>
+      <w:bookmarkEnd w:id="1"/>
     </w:p>
     <w:p>
       <w:pPr>
@@ -490,7 +647,25 @@
           <w:sz w:val="24"/>
           <w:szCs w:val="24"/>
         </w:rPr>
-        <w:t xml:space="preserve">Sözleşme ve sözleşme ekinde bulunan ödeme planına göre; şirketimize ödemeniz  gereken tutarların tarafınızca ödemeyerek gecikmeye düştüğünüz tespit edilmiştir. </w:t>
+        <w:t xml:space="preserve">Sözleşme ve sözleşme ekinde bulunan ödeme planına göre; şirketimize </w:t>
+      </w:r>
+      <w:proofErr w:type="gramStart"/>
+      <w:r>
+        <w:rPr>
+          <w:bCs/>
+          <w:sz w:val="24"/>
+          <w:szCs w:val="24"/>
+        </w:rPr>
+        <w:t>ödemeniz  gereken</w:t>
+      </w:r>
+      <w:proofErr w:type="gramEnd"/>
+      <w:r>
+        <w:rPr>
+          <w:bCs/>
+          <w:sz w:val="24"/>
+          <w:szCs w:val="24"/>
+        </w:rPr>
+        <w:t xml:space="preserve"> tutarların tarafınızca ödemeyerek gecikmeye düştüğünüz tespit edilmiştir. </w:t>
       </w:r>
       <w:r>
         <w:rPr>
@@ -521,7 +696,25 @@
           <w:sz w:val="24"/>
           <w:szCs w:val="24"/>
         </w:rPr>
-        <w:t xml:space="preserve"> tarihi itibariyle belirtilen borç dökümünde görüldüğü üzere şirketimize ; </w:t>
+        <w:t xml:space="preserve"> tarihi itibariyle belirtilen borç dökümünde görüldüğü üzere </w:t>
+      </w:r>
+      <w:proofErr w:type="gramStart"/>
+      <w:r>
+        <w:rPr>
+          <w:bCs/>
+          <w:sz w:val="24"/>
+          <w:szCs w:val="24"/>
+        </w:rPr>
+        <w:t>şirketimize ;</w:t>
+      </w:r>
+      <w:proofErr w:type="gramEnd"/>
+      <w:r>
+        <w:rPr>
+          <w:bCs/>
+          <w:sz w:val="24"/>
+          <w:szCs w:val="24"/>
+        </w:rPr>
+        <w:t xml:space="preserve"> </w:t>
       </w:r>
       <w:r>
         <w:rPr>
@@ -587,7 +780,43 @@
           <w:sz w:val="24"/>
           <w:szCs w:val="24"/>
         </w:rPr>
-        <w:t xml:space="preserve">TL tahsil takip gideri ile birlikte toplamda : </w:t>
+        <w:t xml:space="preserve">TL tahsil takip gideri </w:t>
+      </w:r>
+      <w:proofErr w:type="gramStart"/>
+      <w:r>
+        <w:rPr>
+          <w:bCs/>
+          <w:sz w:val="24"/>
+          <w:szCs w:val="24"/>
+        </w:rPr>
+        <w:t>ile birlikte</w:t>
+      </w:r>
+      <w:proofErr w:type="gramEnd"/>
+      <w:r>
+        <w:rPr>
+          <w:bCs/>
+          <w:sz w:val="24"/>
+          <w:szCs w:val="24"/>
+        </w:rPr>
+        <w:t xml:space="preserve"> </w:t>
+      </w:r>
+      <w:proofErr w:type="gramStart"/>
+      <w:r>
+        <w:rPr>
+          <w:bCs/>
+          <w:sz w:val="24"/>
+          <w:szCs w:val="24"/>
+        </w:rPr>
+        <w:t>toplamda :</w:t>
+      </w:r>
+      <w:proofErr w:type="gramEnd"/>
+      <w:r>
+        <w:rPr>
+          <w:bCs/>
+          <w:sz w:val="24"/>
+          <w:szCs w:val="24"/>
+        </w:rPr>
+        <w:t xml:space="preserve"> </w:t>
       </w:r>
       <w:r>
         <w:rPr>
@@ -672,7 +901,25 @@
           <w:sz w:val="24"/>
           <w:szCs w:val="24"/>
         </w:rPr>
-        <w:t>Gerçekleşmiş bulunan temerrüdünüz sebebi ile ; İ</w:t>
+        <w:t xml:space="preserve">Gerçekleşmiş bulunan temerrüdünüz sebebi </w:t>
+      </w:r>
+      <w:proofErr w:type="gramStart"/>
+      <w:r>
+        <w:rPr>
+          <w:bCs/>
+          <w:sz w:val="24"/>
+          <w:szCs w:val="24"/>
+        </w:rPr>
+        <w:t>ile ;</w:t>
+      </w:r>
+      <w:proofErr w:type="gramEnd"/>
+      <w:r>
+        <w:rPr>
+          <w:bCs/>
+          <w:sz w:val="24"/>
+          <w:szCs w:val="24"/>
+        </w:rPr>
+        <w:t xml:space="preserve"> İ</w:t>
       </w:r>
       <w:r>
         <w:rPr>
@@ -695,7 +942,37 @@
           <w:sz w:val="24"/>
           <w:szCs w:val="24"/>
         </w:rPr>
-        <w:t xml:space="preserve"> içinde, ihtar tarihinden itibaren sözleşme gereği işleyecek temerrüt faizi ile birlikte ödemenizi,</w:t>
+        <w:t xml:space="preserve"> içinde, ihtar tarihinden itibaren sözleşme gereği işleyecek temerrüt </w:t>
+      </w:r>
+      <w:r>
+        <w:rPr>
+          <w:sz w:val="24"/>
+          <w:szCs w:val="24"/>
+        </w:rPr>
+        <w:t>masrafı</w:t>
+      </w:r>
+      <w:r>
+        <w:rPr>
+          <w:sz w:val="24"/>
+          <w:szCs w:val="24"/>
+        </w:rPr>
+        <w:t xml:space="preserve"> </w:t>
+      </w:r>
+      <w:proofErr w:type="gramStart"/>
+      <w:r>
+        <w:rPr>
+          <w:sz w:val="24"/>
+          <w:szCs w:val="24"/>
+        </w:rPr>
+        <w:t>ile birlikte</w:t>
+      </w:r>
+      <w:proofErr w:type="gramEnd"/>
+      <w:r>
+        <w:rPr>
+          <w:sz w:val="24"/>
+          <w:szCs w:val="24"/>
+        </w:rPr>
+        <w:t xml:space="preserve"> ödemenizi,</w:t>
       </w:r>
     </w:p>
     <w:p>
@@ -768,14 +1045,30 @@
           <w:sz w:val="24"/>
           <w:szCs w:val="24"/>
         </w:rPr>
-        <w:t>adesi gelmeyen bakiye borçlarınızın tamamını muaccel kılacağımızı ve sözleşmeyi bakiye borç muaccel kılmak suretiyle fesih ede</w:t>
-      </w:r>
-      <w:r>
-        <w:rPr>
-          <w:sz w:val="24"/>
-          <w:szCs w:val="24"/>
-        </w:rPr>
-        <w:t>bileceğimizi,</w:t>
+        <w:t xml:space="preserve">adesi gelmeyen bakiye borçlarınızın tamamını muaccel kılacağımızı ve sözleşmeyi bakiye borç muaccel kılmak suretiyle </w:t>
+      </w:r>
+      <w:proofErr w:type="gramStart"/>
+      <w:r>
+        <w:rPr>
+          <w:sz w:val="24"/>
+          <w:szCs w:val="24"/>
+        </w:rPr>
+        <w:t>fesih ede</w:t>
+      </w:r>
+      <w:r>
+        <w:rPr>
+          <w:sz w:val="24"/>
+          <w:szCs w:val="24"/>
+        </w:rPr>
+        <w:t>bileceğimizi</w:t>
+      </w:r>
+      <w:proofErr w:type="gramEnd"/>
+      <w:r>
+        <w:rPr>
+          <w:sz w:val="24"/>
+          <w:szCs w:val="24"/>
+        </w:rPr>
+        <w:t>,</w:t>
       </w:r>
       <w:r>
         <w:rPr>
@@ -875,7 +1168,23 @@
           <w:sz w:val="24"/>
           <w:szCs w:val="24"/>
         </w:rPr>
-        <w:t xml:space="preserve">Veya borcunuzu yukarıda belirtilen şekilde ödemediğiniz taktirde; sözleşmeyi fesih etmeden henüz vadesi gelmeyen bakiye borçlarınızın tamamının muaccel kılacağımızı, bu halde bu </w:t>
+        <w:t xml:space="preserve">Veya borcunuzu yukarıda belirtilen şekilde ödemediğiniz taktirde; sözleşmeyi </w:t>
+      </w:r>
+      <w:proofErr w:type="gramStart"/>
+      <w:r>
+        <w:rPr>
+          <w:sz w:val="24"/>
+          <w:szCs w:val="24"/>
+        </w:rPr>
+        <w:t>fesih etmeden</w:t>
+      </w:r>
+      <w:proofErr w:type="gramEnd"/>
+      <w:r>
+        <w:rPr>
+          <w:sz w:val="24"/>
+          <w:szCs w:val="24"/>
+        </w:rPr>
+        <w:t xml:space="preserve"> henüz vadesi gelmeyen bakiye borçlarınızın tamamının muaccel kılacağımızı, bu halde bu </w:t>
       </w:r>
       <w:r>
         <w:rPr>
@@ -899,12 +1208,21 @@
         </w:numPr>
         <w:jc w:val="both"/>
       </w:pPr>
-      <w:r>
-        <w:rPr>
-          <w:sz w:val="24"/>
-          <w:szCs w:val="24"/>
-        </w:rPr>
-        <w:t>Veya, borcunuzu yukarıda belirtilen şekilde ödemediğiniz taktirde,</w:t>
+      <w:proofErr w:type="gramStart"/>
+      <w:r>
+        <w:rPr>
+          <w:sz w:val="24"/>
+          <w:szCs w:val="24"/>
+        </w:rPr>
+        <w:t>Veya,</w:t>
+      </w:r>
+      <w:proofErr w:type="gramEnd"/>
+      <w:r>
+        <w:rPr>
+          <w:sz w:val="24"/>
+          <w:szCs w:val="24"/>
+        </w:rPr>
+        <w:t xml:space="preserve"> borcunuzu yukarıda belirtilen şekilde ödemediğiniz taktirde,</w:t>
       </w:r>
       <w:r>
         <w:rPr>
@@ -1079,7 +1397,6 @@
           <w:sz w:val="24"/>
           <w:szCs w:val="24"/>
         </w:rPr>
-        <w:lastRenderedPageBreak/>
         <w:t>Yukarıda belirtilen seçimlik haklarımızın, herhangi birinin ayrıca ihtar veya ihbara gerek olmaksızın tarafımızca dile</w:t>
       </w:r>
       <w:r>
@@ -1132,6 +1449,7 @@
           <w:szCs w:val="24"/>
         </w:rPr>
       </w:pPr>
+      <w:proofErr w:type="gramStart"/>
       <w:r>
         <w:rPr>
           <w:sz w:val="24"/>
@@ -1144,7 +1462,15 @@
           <w:sz w:val="24"/>
           <w:szCs w:val="24"/>
         </w:rPr>
-        <w:t>htar ve ihbar ederiz.</w:t>
+        <w:t>htar</w:t>
+      </w:r>
+      <w:proofErr w:type="gramEnd"/>
+      <w:r>
+        <w:rPr>
+          <w:sz w:val="24"/>
+          <w:szCs w:val="24"/>
+        </w:rPr>
+        <w:t xml:space="preserve"> ve ihbar ederiz.</w:t>
       </w:r>
     </w:p>
     <w:p>

</xml_diff>

<commit_message>
#260127 fix: fixed global settings
</commit_message>
<xml_diff>
--- a/files/ihtar-ticari.docx
+++ b/files/ihtar-ticari.docx
@@ -2,6 +2,49 @@
 <file path=word/document.xml><?xml version="1.0" encoding="utf-8"?>
 <w:document xmlns:wpc="http://schemas.microsoft.com/office/word/2010/wordprocessingCanvas" xmlns:cx="http://schemas.microsoft.com/office/drawing/2014/chartex" xmlns:cx1="http://schemas.microsoft.com/office/drawing/2015/9/8/chartex" xmlns:cx2="http://schemas.microsoft.com/office/drawing/2015/10/21/chartex" xmlns:cx3="http://schemas.microsoft.com/office/drawing/2016/5/9/chartex" xmlns:cx4="http://schemas.microsoft.com/office/drawing/2016/5/10/chartex" xmlns:cx5="http://schemas.microsoft.com/office/drawing/2016/5/11/chartex" xmlns:cx6="http://schemas.microsoft.com/office/drawing/2016/5/12/chartex" xmlns:cx7="http://schemas.microsoft.com/office/drawing/2016/5/13/chartex" xmlns:cx8="http://schemas.microsoft.com/office/drawing/2016/5/14/chartex" xmlns:mc="http://schemas.openxmlformats.org/markup-compatibility/2006" xmlns:aink="http://schemas.microsoft.com/office/drawing/2016/ink" xmlns:am3d="http://schemas.microsoft.com/office/drawing/2017/model3d" xmlns:o="urn:schemas-microsoft-com:office:office" xmlns:oel="http://schemas.microsoft.com/office/2019/extlst" xmlns:r="http://schemas.openxmlformats.org/officeDocument/2006/relationships" xmlns:m="http://schemas.openxmlformats.org/officeDocument/2006/math" xmlns:v="urn:schemas-microsoft-com:vml" xmlns:wp14="http://schemas.microsoft.com/office/word/2010/wordprocessingDrawing" xmlns:wp="http://schemas.openxmlformats.org/drawingml/2006/wordprocessingDrawing" xmlns:w10="urn:schemas-microsoft-com:office:word" xmlns:w="http://schemas.openxmlformats.org/wordprocessingml/2006/main" xmlns:w14="http://schemas.microsoft.com/office/word/2010/wordml" xmlns:w15="http://schemas.microsoft.com/office/word/2012/wordml" xmlns:w16cex="http://schemas.microsoft.com/office/word/2018/wordml/cex" xmlns:w16cid="http://schemas.microsoft.com/office/word/2016/wordml/cid" xmlns:w16="http://schemas.microsoft.com/office/word/2018/wordml" xmlns:w16du="http://schemas.microsoft.com/office/word/2023/wordml/word16du" xmlns:w16sdtdh="http://schemas.microsoft.com/office/word/2020/wordml/sdtdatahash" xmlns:w16sdtfl="http://schemas.microsoft.com/office/word/2024/wordml/sdtformatlock" xmlns:w16se="http://schemas.microsoft.com/office/word/2015/wordml/symex" xmlns:wpg="http://schemas.microsoft.com/office/word/2010/wordprocessingGroup" xmlns:wpi="http://schemas.microsoft.com/office/word/2010/wordprocessingInk" xmlns:wne="http://schemas.microsoft.com/office/word/2006/wordml" xmlns:wps="http://schemas.microsoft.com/office/word/2010/wordprocessingShape" mc:Ignorable="w14 w15 w16se w16cid w16 w16cex w16sdtdh w16sdtfl w16du wp14">
   <w:body>
+    <w:p>
+      <w:pPr>
+        <w:pStyle w:val="Normal2"/>
+        <w:jc w:val="center"/>
+        <w:rPr>
+          <w:b/>
+          <w:bCs/>
+          <w:sz w:val="24"/>
+          <w:szCs w:val="24"/>
+        </w:rPr>
+      </w:pPr>
+      <w:r>
+        <w:rPr>
+          <w:b/>
+          <w:bCs/>
+          <w:sz w:val="24"/>
+          <w:szCs w:val="24"/>
+        </w:rPr>
+        <w:t>T.C.</w:t>
+      </w:r>
+    </w:p>
+    <w:p>
+      <w:pPr>
+        <w:pStyle w:val="Normal2"/>
+        <w:jc w:val="center"/>
+        <w:rPr>
+          <w:b/>
+          <w:bCs/>
+          <w:sz w:val="24"/>
+          <w:szCs w:val="24"/>
+        </w:rPr>
+      </w:pPr>
+      <w:r>
+        <w:rPr>
+          <w:b/>
+          <w:bCs/>
+          <w:noProof/>
+          <w:sz w:val="24"/>
+          <w:szCs w:val="24"/>
+        </w:rPr>
+        <w:t>BEŞİKTAŞ 5. NOTERLİĞİ</w:t>
+      </w:r>
+    </w:p>
     <w:p>
       <w:pPr>
         <w:pStyle w:val="Normal2"/>
@@ -20,13 +63,6 @@
           <w:sz w:val="24"/>
           <w:szCs w:val="24"/>
         </w:rPr>
-        <w:t xml:space="preserve"> </w:t>
-      </w:r>
-      <w:r>
-        <w:rPr>
-          <w:sz w:val="24"/>
-          <w:szCs w:val="24"/>
-        </w:rPr>
         <w:t>{{tarih}}</w:t>
       </w:r>
       <w:r>
@@ -34,7 +70,7 @@
           <w:sz w:val="24"/>
           <w:szCs w:val="24"/>
         </w:rPr>
-        <w:t xml:space="preserve">                        </w:t>
+        <w:t xml:space="preserve">                         </w:t>
       </w:r>
     </w:p>
     <w:p>
@@ -138,7 +174,11 @@
     <w:p>
       <w:pPr>
         <w:pStyle w:val="Normal2"/>
-        <w:jc w:val="both"/>
+        <w:widowControl w:val="0"/>
+        <w:autoSpaceDE w:val="0"/>
+        <w:autoSpaceDN w:val="0"/>
+        <w:adjustRightInd w:val="0"/>
+        <w:spacing w:line="199" w:lineRule="atLeast"/>
         <w:rPr>
           <w:sz w:val="24"/>
           <w:szCs w:val="24"/>
@@ -193,28 +233,7 @@
           <w:sz w:val="24"/>
           <w:szCs w:val="24"/>
         </w:rPr>
-        <w:t>{</w:t>
-      </w:r>
-      <w:r>
-        <w:rPr>
-          <w:sz w:val="24"/>
-          <w:szCs w:val="24"/>
-        </w:rPr>
-        <w:t>isim</w:t>
-      </w:r>
-      <w:r>
-        <w:rPr>
-          <w:sz w:val="24"/>
-          <w:szCs w:val="24"/>
-        </w:rPr>
-        <w:t>}}</w:t>
-      </w:r>
-      <w:r>
-        <w:rPr>
-          <w:sz w:val="24"/>
-          <w:szCs w:val="24"/>
-        </w:rPr>
-        <w:t xml:space="preserve"> ({{</w:t>
+        <w:t>{isim}} ({{</w:t>
       </w:r>
       <w:proofErr w:type="spellStart"/>
       <w:r>
@@ -303,7 +322,6 @@
         <w:tab/>
         <w:t xml:space="preserve">:  </w:t>
       </w:r>
-      <w:bookmarkStart w:id="0" w:name="_Hlk219886425"/>
       <w:r>
         <w:rPr>
           <w:sz w:val="24"/>
@@ -336,7 +354,6 @@
         <w:t xml:space="preserve"> ihtarıdır.</w:t>
       </w:r>
     </w:p>
-    <w:bookmarkEnd w:id="0"/>
     <w:p>
       <w:pPr>
         <w:pStyle w:val="Normal2"/>
@@ -388,7 +405,7 @@
         <w:pStyle w:val="Normal2"/>
         <w:jc w:val="both"/>
       </w:pPr>
-      <w:bookmarkStart w:id="1" w:name="_Hlk68862260"/>
+      <w:bookmarkStart w:id="0" w:name="_Hlk68862260"/>
       <w:r>
         <w:rPr>
           <w:b/>
@@ -446,6 +463,164 @@
         <w:t>sozlesme_no</w:t>
       </w:r>
       <w:proofErr w:type="spellEnd"/>
+      <w:r>
+        <w:rPr>
+          <w:sz w:val="24"/>
+          <w:szCs w:val="24"/>
+        </w:rPr>
+        <w:t xml:space="preserve">}} </w:t>
+      </w:r>
+      <w:r>
+        <w:rPr>
+          <w:sz w:val="24"/>
+          <w:szCs w:val="24"/>
+        </w:rPr>
+        <w:t>numaralı ve konusu</w:t>
+      </w:r>
+      <w:r>
+        <w:rPr>
+          <w:sz w:val="24"/>
+          <w:szCs w:val="24"/>
+        </w:rPr>
+        <w:t xml:space="preserve"> {{il</w:t>
+      </w:r>
+      <w:proofErr w:type="gramStart"/>
+      <w:r>
+        <w:rPr>
+          <w:sz w:val="24"/>
+          <w:szCs w:val="24"/>
+        </w:rPr>
+        <w:t>}}{</w:t>
+      </w:r>
+      <w:proofErr w:type="gramEnd"/>
+      <w:r>
+        <w:rPr>
+          <w:sz w:val="24"/>
+          <w:szCs w:val="24"/>
+        </w:rPr>
+        <w:t>{ilce</w:t>
+      </w:r>
+      <w:proofErr w:type="gramStart"/>
+      <w:r>
+        <w:rPr>
+          <w:sz w:val="24"/>
+          <w:szCs w:val="24"/>
+        </w:rPr>
+        <w:t>}}{</w:t>
+      </w:r>
+      <w:proofErr w:type="gramEnd"/>
+      <w:r>
+        <w:rPr>
+          <w:sz w:val="24"/>
+          <w:szCs w:val="24"/>
+        </w:rPr>
+        <w:t>{ada</w:t>
+      </w:r>
+      <w:proofErr w:type="gramStart"/>
+      <w:r>
+        <w:rPr>
+          <w:sz w:val="24"/>
+          <w:szCs w:val="24"/>
+        </w:rPr>
+        <w:t>}}{</w:t>
+      </w:r>
+      <w:proofErr w:type="gramEnd"/>
+      <w:r>
+        <w:rPr>
+          <w:sz w:val="24"/>
+          <w:szCs w:val="24"/>
+        </w:rPr>
+        <w:t>{parsel</w:t>
+      </w:r>
+      <w:proofErr w:type="gramStart"/>
+      <w:r>
+        <w:rPr>
+          <w:sz w:val="24"/>
+          <w:szCs w:val="24"/>
+        </w:rPr>
+        <w:t>}}{</w:t>
+      </w:r>
+      <w:proofErr w:type="gramEnd"/>
+      <w:r>
+        <w:rPr>
+          <w:sz w:val="24"/>
+          <w:szCs w:val="24"/>
+        </w:rPr>
+        <w:t>{blok</w:t>
+      </w:r>
+      <w:proofErr w:type="gramStart"/>
+      <w:r>
+        <w:rPr>
+          <w:sz w:val="24"/>
+          <w:szCs w:val="24"/>
+        </w:rPr>
+        <w:t>}}{</w:t>
+      </w:r>
+      <w:proofErr w:type="gramEnd"/>
+      <w:r>
+        <w:rPr>
+          <w:sz w:val="24"/>
+          <w:szCs w:val="24"/>
+        </w:rPr>
+        <w:t>{</w:t>
+      </w:r>
+      <w:proofErr w:type="spellStart"/>
+      <w:r>
+        <w:rPr>
+          <w:sz w:val="24"/>
+          <w:szCs w:val="24"/>
+        </w:rPr>
+        <w:t>bagimsiz_</w:t>
+      </w:r>
+      <w:proofErr w:type="gramStart"/>
+      <w:r>
+        <w:rPr>
+          <w:sz w:val="24"/>
+          <w:szCs w:val="24"/>
+        </w:rPr>
+        <w:t>bolum</w:t>
+      </w:r>
+      <w:proofErr w:type="spellEnd"/>
+      <w:r>
+        <w:rPr>
+          <w:sz w:val="24"/>
+          <w:szCs w:val="24"/>
+        </w:rPr>
+        <w:t>}}</w:t>
+      </w:r>
+      <w:r>
+        <w:rPr>
+          <w:sz w:val="24"/>
+          <w:szCs w:val="24"/>
+        </w:rPr>
+        <w:t>olan</w:t>
+      </w:r>
+      <w:proofErr w:type="gramEnd"/>
+      <w:r>
+        <w:rPr>
+          <w:sz w:val="24"/>
+          <w:szCs w:val="24"/>
+        </w:rPr>
+        <w:t xml:space="preserve"> </w:t>
+      </w:r>
+      <w:proofErr w:type="gramStart"/>
+      <w:r>
+        <w:rPr>
+          <w:sz w:val="24"/>
+          <w:szCs w:val="24"/>
+        </w:rPr>
+        <w:t>bir  finansal</w:t>
+      </w:r>
+      <w:proofErr w:type="gramEnd"/>
+      <w:r>
+        <w:rPr>
+          <w:sz w:val="24"/>
+          <w:szCs w:val="24"/>
+        </w:rPr>
+        <w:t xml:space="preserve"> kiralama sözleşmesi imzalamışlardır.</w:t>
+      </w:r>
+      <w:bookmarkStart w:id="1" w:name="_Hlk68862272"/>
+      <w:bookmarkEnd w:id="0"/>
     </w:p>
     <w:p>
       <w:pPr>
@@ -457,430 +632,248 @@
           <w:szCs w:val="24"/>
         </w:rPr>
       </w:pPr>
-      <w:r>
-        <w:rPr>
-          <w:sz w:val="24"/>
-          <w:szCs w:val="24"/>
-        </w:rPr>
-        <w:t xml:space="preserve">}} </w:t>
-      </w:r>
-      <w:r>
-        <w:rPr>
-          <w:sz w:val="24"/>
-          <w:szCs w:val="24"/>
-        </w:rPr>
-        <w:t xml:space="preserve">numaralı ve konusu </w:t>
-      </w:r>
-      <w:r>
-        <w:rPr>
-          <w:sz w:val="24"/>
-          <w:szCs w:val="24"/>
-        </w:rPr>
-        <w:t>{{il</w:t>
-      </w:r>
-      <w:proofErr w:type="gramStart"/>
-      <w:r>
-        <w:rPr>
-          <w:sz w:val="24"/>
-          <w:szCs w:val="24"/>
-        </w:rPr>
-        <w:t>}}{</w:t>
-      </w:r>
-      <w:proofErr w:type="gramEnd"/>
-      <w:r>
-        <w:rPr>
-          <w:sz w:val="24"/>
-          <w:szCs w:val="24"/>
-        </w:rPr>
-        <w:t>{ilce</w:t>
-      </w:r>
-      <w:proofErr w:type="gramStart"/>
-      <w:r>
-        <w:rPr>
-          <w:sz w:val="24"/>
-          <w:szCs w:val="24"/>
-        </w:rPr>
-        <w:t>}}{</w:t>
-      </w:r>
-      <w:proofErr w:type="gramEnd"/>
-      <w:r>
-        <w:rPr>
-          <w:sz w:val="24"/>
-          <w:szCs w:val="24"/>
-        </w:rPr>
-        <w:t>{ada</w:t>
-      </w:r>
-      <w:proofErr w:type="gramStart"/>
-      <w:r>
-        <w:rPr>
-          <w:sz w:val="24"/>
-          <w:szCs w:val="24"/>
-        </w:rPr>
-        <w:t>}}{</w:t>
-      </w:r>
-      <w:proofErr w:type="gramEnd"/>
-      <w:r>
-        <w:rPr>
-          <w:sz w:val="24"/>
-          <w:szCs w:val="24"/>
-        </w:rPr>
-        <w:t>{parsel</w:t>
-      </w:r>
-      <w:proofErr w:type="gramStart"/>
-      <w:r>
-        <w:rPr>
-          <w:sz w:val="24"/>
-          <w:szCs w:val="24"/>
-        </w:rPr>
-        <w:t>}}{</w:t>
-      </w:r>
-      <w:proofErr w:type="gramEnd"/>
-      <w:r>
-        <w:rPr>
-          <w:sz w:val="24"/>
-          <w:szCs w:val="24"/>
-        </w:rPr>
-        <w:t>{blok</w:t>
-      </w:r>
-      <w:proofErr w:type="gramStart"/>
-      <w:r>
-        <w:rPr>
-          <w:sz w:val="24"/>
-          <w:szCs w:val="24"/>
-        </w:rPr>
-        <w:t>}}{</w:t>
-      </w:r>
-      <w:proofErr w:type="gramEnd"/>
-      <w:r>
-        <w:rPr>
-          <w:sz w:val="24"/>
-          <w:szCs w:val="24"/>
-        </w:rPr>
-        <w:t>{</w:t>
-      </w:r>
-      <w:proofErr w:type="spellStart"/>
-      <w:r>
-        <w:rPr>
-          <w:sz w:val="24"/>
-          <w:szCs w:val="24"/>
-        </w:rPr>
-        <w:t>bagimsiz_</w:t>
-      </w:r>
-      <w:proofErr w:type="gramStart"/>
-      <w:r>
-        <w:rPr>
-          <w:sz w:val="24"/>
-          <w:szCs w:val="24"/>
-        </w:rPr>
-        <w:t>bolum</w:t>
-      </w:r>
-      <w:proofErr w:type="spellEnd"/>
-      <w:r>
-        <w:rPr>
-          <w:sz w:val="24"/>
-          <w:szCs w:val="24"/>
-        </w:rPr>
-        <w:t>}}</w:t>
-      </w:r>
-      <w:r>
-        <w:rPr>
-          <w:sz w:val="24"/>
-          <w:szCs w:val="24"/>
-        </w:rPr>
-        <w:t>olan</w:t>
-      </w:r>
-      <w:proofErr w:type="gramEnd"/>
-      <w:r>
-        <w:rPr>
-          <w:sz w:val="24"/>
-          <w:szCs w:val="24"/>
-        </w:rPr>
-        <w:t xml:space="preserve"> </w:t>
-      </w:r>
-      <w:proofErr w:type="gramStart"/>
-      <w:r>
-        <w:rPr>
-          <w:sz w:val="24"/>
-          <w:szCs w:val="24"/>
-        </w:rPr>
-        <w:t>bir  finansal</w:t>
-      </w:r>
-      <w:proofErr w:type="gramEnd"/>
-      <w:r>
-        <w:rPr>
-          <w:sz w:val="24"/>
-          <w:szCs w:val="24"/>
-        </w:rPr>
-        <w:t xml:space="preserve"> kiralama sözleşmesi imzalamışlardır.</w:t>
-      </w:r>
-      <w:bookmarkEnd w:id="1"/>
     </w:p>
     <w:p>
       <w:pPr>
         <w:pStyle w:val="Normal2"/>
         <w:jc w:val="both"/>
         <w:rPr>
-          <w:sz w:val="24"/>
-          <w:szCs w:val="24"/>
-        </w:rPr>
-      </w:pPr>
-    </w:p>
+          <w:bCs/>
+        </w:rPr>
+      </w:pPr>
+      <w:r>
+        <w:rPr>
+          <w:b/>
+          <w:sz w:val="24"/>
+          <w:szCs w:val="24"/>
+        </w:rPr>
+        <w:t xml:space="preserve">2. </w:t>
+      </w:r>
+      <w:r>
+        <w:rPr>
+          <w:bCs/>
+          <w:sz w:val="24"/>
+          <w:szCs w:val="24"/>
+        </w:rPr>
+        <w:t xml:space="preserve">Sözleşme ve sözleşme ekinde bulunan ödeme planına göre; şirketimize </w:t>
+      </w:r>
+      <w:proofErr w:type="gramStart"/>
+      <w:r>
+        <w:rPr>
+          <w:bCs/>
+          <w:sz w:val="24"/>
+          <w:szCs w:val="24"/>
+        </w:rPr>
+        <w:t>ödemeniz  gereken</w:t>
+      </w:r>
+      <w:proofErr w:type="gramEnd"/>
+      <w:r>
+        <w:rPr>
+          <w:bCs/>
+          <w:sz w:val="24"/>
+          <w:szCs w:val="24"/>
+        </w:rPr>
+        <w:t xml:space="preserve"> tutarların tarafınızca ödemeyerek gecikmeye düştüğünüz tespit edilmiştir. </w:t>
+      </w:r>
+      <w:r>
+        <w:rPr>
+          <w:bCs/>
+          <w:sz w:val="24"/>
+          <w:szCs w:val="24"/>
+        </w:rPr>
+        <w:t>{{</w:t>
+      </w:r>
+      <w:r>
+        <w:rPr>
+          <w:sz w:val="24"/>
+          <w:szCs w:val="24"/>
+        </w:rPr>
+        <w:t>tarih</w:t>
+      </w:r>
+      <w:r>
+        <w:rPr>
+          <w:bCs/>
+          <w:sz w:val="24"/>
+          <w:szCs w:val="24"/>
+        </w:rPr>
+        <w:t>}}</w:t>
+      </w:r>
+      <w:r>
+        <w:rPr>
+          <w:bCs/>
+          <w:sz w:val="24"/>
+          <w:szCs w:val="24"/>
+        </w:rPr>
+        <w:t xml:space="preserve"> tarihi itibariyle belirtilen borç dökümünde görüldüğü üzere </w:t>
+      </w:r>
+      <w:proofErr w:type="gramStart"/>
+      <w:r>
+        <w:rPr>
+          <w:bCs/>
+          <w:sz w:val="24"/>
+          <w:szCs w:val="24"/>
+        </w:rPr>
+        <w:t>şirketimize ;</w:t>
+      </w:r>
+      <w:proofErr w:type="gramEnd"/>
+      <w:r>
+        <w:rPr>
+          <w:bCs/>
+          <w:sz w:val="24"/>
+          <w:szCs w:val="24"/>
+        </w:rPr>
+        <w:t xml:space="preserve"> </w:t>
+      </w:r>
+      <w:r>
+        <w:rPr>
+          <w:bCs/>
+          <w:sz w:val="24"/>
+          <w:szCs w:val="24"/>
+        </w:rPr>
+        <w:t>{{</w:t>
+      </w:r>
+      <w:proofErr w:type="spellStart"/>
+      <w:r>
+        <w:rPr>
+          <w:bCs/>
+          <w:sz w:val="24"/>
+          <w:szCs w:val="24"/>
+        </w:rPr>
+        <w:t>gecikme_bakiye</w:t>
+      </w:r>
+      <w:proofErr w:type="spellEnd"/>
+      <w:r>
+        <w:rPr>
+          <w:bCs/>
+          <w:sz w:val="24"/>
+          <w:szCs w:val="24"/>
+        </w:rPr>
+        <w:t xml:space="preserve">}} </w:t>
+      </w:r>
+      <w:r>
+        <w:rPr>
+          <w:bCs/>
+          <w:sz w:val="24"/>
+          <w:szCs w:val="24"/>
+        </w:rPr>
+        <w:t xml:space="preserve">TL kira bedeli borcunuz bulunmaktadır. Yine sözleşme gereği müvekkil şirkete ödemeniz gereken </w:t>
+      </w:r>
+      <w:r>
+        <w:rPr>
+          <w:bCs/>
+          <w:sz w:val="24"/>
+          <w:szCs w:val="24"/>
+        </w:rPr>
+        <w:t>{{</w:t>
+      </w:r>
+      <w:proofErr w:type="spellStart"/>
+      <w:r>
+        <w:rPr>
+          <w:bCs/>
+        </w:rPr>
+        <w:t>masraf_bakiye</w:t>
+      </w:r>
+      <w:proofErr w:type="spellEnd"/>
+      <w:r>
+        <w:rPr>
+          <w:bCs/>
+          <w:sz w:val="24"/>
+          <w:szCs w:val="24"/>
+        </w:rPr>
+        <w:t xml:space="preserve">}} </w:t>
+      </w:r>
+      <w:r>
+        <w:rPr>
+          <w:bCs/>
+          <w:sz w:val="24"/>
+          <w:szCs w:val="24"/>
+        </w:rPr>
+        <w:t xml:space="preserve">TL tahsil takip gideri </w:t>
+      </w:r>
+      <w:proofErr w:type="gramStart"/>
+      <w:r>
+        <w:rPr>
+          <w:bCs/>
+          <w:sz w:val="24"/>
+          <w:szCs w:val="24"/>
+        </w:rPr>
+        <w:t>ile birlikte</w:t>
+      </w:r>
+      <w:proofErr w:type="gramEnd"/>
+      <w:r>
+        <w:rPr>
+          <w:bCs/>
+          <w:sz w:val="24"/>
+          <w:szCs w:val="24"/>
+        </w:rPr>
+        <w:t xml:space="preserve"> </w:t>
+      </w:r>
+      <w:proofErr w:type="gramStart"/>
+      <w:r>
+        <w:rPr>
+          <w:bCs/>
+          <w:sz w:val="24"/>
+          <w:szCs w:val="24"/>
+        </w:rPr>
+        <w:t>toplamda :</w:t>
+      </w:r>
+      <w:proofErr w:type="gramEnd"/>
+      <w:r>
+        <w:rPr>
+          <w:bCs/>
+          <w:sz w:val="24"/>
+          <w:szCs w:val="24"/>
+        </w:rPr>
+        <w:t xml:space="preserve"> </w:t>
+      </w:r>
+      <w:r>
+        <w:rPr>
+          <w:bCs/>
+          <w:sz w:val="24"/>
+          <w:szCs w:val="24"/>
+        </w:rPr>
+        <w:t>{{</w:t>
+      </w:r>
+      <w:proofErr w:type="spellStart"/>
+      <w:r>
+        <w:rPr>
+          <w:bCs/>
+          <w:sz w:val="24"/>
+          <w:szCs w:val="24"/>
+        </w:rPr>
+        <w:t>toplam_borc_bakiye</w:t>
+      </w:r>
+      <w:proofErr w:type="spellEnd"/>
+      <w:r>
+        <w:rPr>
+          <w:bCs/>
+          <w:sz w:val="24"/>
+          <w:szCs w:val="24"/>
+        </w:rPr>
+        <w:t>}}</w:t>
+      </w:r>
+      <w:r>
+        <w:rPr>
+          <w:bCs/>
+          <w:sz w:val="24"/>
+          <w:szCs w:val="24"/>
+        </w:rPr>
+        <w:t xml:space="preserve"> TL borcunuz bulunmaktadır.</w:t>
+      </w:r>
+      <w:r>
+        <w:rPr>
+          <w:sz w:val="24"/>
+          <w:szCs w:val="24"/>
+        </w:rPr>
+        <w:t xml:space="preserve"> </w:t>
+      </w:r>
+    </w:p>
+    <w:bookmarkEnd w:id="1"/>
     <w:p>
       <w:pPr>
         <w:pStyle w:val="Normal2"/>
         <w:jc w:val="both"/>
         <w:rPr>
-          <w:bCs/>
-        </w:rPr>
-      </w:pPr>
-      <w:r>
-        <w:rPr>
-          <w:b/>
-          <w:sz w:val="24"/>
-          <w:szCs w:val="24"/>
-        </w:rPr>
-        <w:t xml:space="preserve">2. </w:t>
-      </w:r>
-      <w:r>
-        <w:rPr>
-          <w:bCs/>
-          <w:sz w:val="24"/>
-          <w:szCs w:val="24"/>
-        </w:rPr>
-        <w:t xml:space="preserve">Sözleşme ve sözleşme ekinde bulunan ödeme planına göre; şirketimize </w:t>
-      </w:r>
-      <w:proofErr w:type="gramStart"/>
-      <w:r>
-        <w:rPr>
-          <w:bCs/>
-          <w:sz w:val="24"/>
-          <w:szCs w:val="24"/>
-        </w:rPr>
-        <w:t>ödemeniz  gereken</w:t>
-      </w:r>
-      <w:proofErr w:type="gramEnd"/>
-      <w:r>
-        <w:rPr>
-          <w:bCs/>
-          <w:sz w:val="24"/>
-          <w:szCs w:val="24"/>
-        </w:rPr>
-        <w:t xml:space="preserve"> tutarların tarafınızca ödemeyerek gecikmeye düştüğünüz tespit edilmiştir. </w:t>
-      </w:r>
-      <w:r>
-        <w:rPr>
-          <w:bCs/>
-          <w:sz w:val="24"/>
-          <w:szCs w:val="24"/>
-        </w:rPr>
-        <w:t>{{</w:t>
-      </w:r>
-      <w:r>
-        <w:rPr>
-          <w:sz w:val="24"/>
-          <w:szCs w:val="24"/>
-        </w:rPr>
-        <w:t>tarih</w:t>
-      </w:r>
-      <w:r>
-        <w:rPr>
-          <w:bCs/>
-          <w:sz w:val="24"/>
-          <w:szCs w:val="24"/>
-        </w:rPr>
-        <w:t>}}</w:t>
-      </w:r>
-      <w:r>
-        <w:rPr>
-          <w:bCs/>
-          <w:sz w:val="24"/>
-          <w:szCs w:val="24"/>
-        </w:rPr>
-        <w:t xml:space="preserve"> tarihi itibariyle belirtilen borç dökümünde görüldüğü üzere </w:t>
-      </w:r>
-      <w:proofErr w:type="gramStart"/>
-      <w:r>
-        <w:rPr>
-          <w:bCs/>
-          <w:sz w:val="24"/>
-          <w:szCs w:val="24"/>
-        </w:rPr>
-        <w:t>şirketimize ;</w:t>
-      </w:r>
-      <w:proofErr w:type="gramEnd"/>
-      <w:r>
-        <w:rPr>
-          <w:bCs/>
-          <w:sz w:val="24"/>
-          <w:szCs w:val="24"/>
-        </w:rPr>
-        <w:t xml:space="preserve"> </w:t>
-      </w:r>
-      <w:r>
-        <w:rPr>
-          <w:bCs/>
-          <w:sz w:val="24"/>
-          <w:szCs w:val="24"/>
-        </w:rPr>
-        <w:t>{{</w:t>
-      </w:r>
-      <w:proofErr w:type="spellStart"/>
-      <w:r>
-        <w:rPr>
-          <w:bCs/>
-          <w:sz w:val="24"/>
-          <w:szCs w:val="24"/>
-        </w:rPr>
-        <w:t>gecikme_bakiye</w:t>
-      </w:r>
-      <w:proofErr w:type="spellEnd"/>
-      <w:r>
-        <w:rPr>
-          <w:bCs/>
-          <w:sz w:val="24"/>
-          <w:szCs w:val="24"/>
-        </w:rPr>
-        <w:t xml:space="preserve">}} </w:t>
-      </w:r>
-      <w:r>
-        <w:rPr>
-          <w:bCs/>
-          <w:sz w:val="24"/>
-          <w:szCs w:val="24"/>
-        </w:rPr>
-        <w:t xml:space="preserve">TL kira bedeli borcunuz bulunmaktadır. Yine sözleşme gereği müvekkil şirkete ödemeniz gereken </w:t>
-      </w:r>
-      <w:r>
-        <w:rPr>
-          <w:bCs/>
-          <w:sz w:val="24"/>
-          <w:szCs w:val="24"/>
-        </w:rPr>
-        <w:t>{{</w:t>
-      </w:r>
-      <w:proofErr w:type="spellStart"/>
-      <w:r>
-        <w:rPr>
-          <w:bCs/>
-        </w:rPr>
-        <w:t>masraf_bakiye</w:t>
-      </w:r>
-      <w:proofErr w:type="spellEnd"/>
-      <w:r>
-        <w:rPr>
-          <w:bCs/>
-          <w:sz w:val="24"/>
-          <w:szCs w:val="24"/>
-        </w:rPr>
-        <w:t xml:space="preserve">}} </w:t>
-      </w:r>
-      <w:r>
-        <w:rPr>
-          <w:bCs/>
-          <w:sz w:val="24"/>
-          <w:szCs w:val="24"/>
-        </w:rPr>
-        <w:t xml:space="preserve">TL tahsil takip gideri </w:t>
-      </w:r>
-      <w:proofErr w:type="gramStart"/>
-      <w:r>
-        <w:rPr>
-          <w:bCs/>
-          <w:sz w:val="24"/>
-          <w:szCs w:val="24"/>
-        </w:rPr>
-        <w:t>ile birlikte</w:t>
-      </w:r>
-      <w:proofErr w:type="gramEnd"/>
-      <w:r>
-        <w:rPr>
-          <w:bCs/>
-          <w:sz w:val="24"/>
-          <w:szCs w:val="24"/>
-        </w:rPr>
-        <w:t xml:space="preserve"> </w:t>
-      </w:r>
-      <w:proofErr w:type="gramStart"/>
-      <w:r>
-        <w:rPr>
-          <w:bCs/>
-          <w:sz w:val="24"/>
-          <w:szCs w:val="24"/>
-        </w:rPr>
-        <w:t>toplamda :</w:t>
-      </w:r>
-      <w:proofErr w:type="gramEnd"/>
-      <w:r>
-        <w:rPr>
-          <w:bCs/>
-          <w:sz w:val="24"/>
-          <w:szCs w:val="24"/>
-        </w:rPr>
-        <w:t xml:space="preserve"> </w:t>
-      </w:r>
-      <w:r>
-        <w:rPr>
-          <w:bCs/>
-          <w:sz w:val="24"/>
-          <w:szCs w:val="24"/>
-        </w:rPr>
-        <w:t>{{</w:t>
-      </w:r>
-      <w:proofErr w:type="spellStart"/>
-      <w:r>
-        <w:rPr>
-          <w:bCs/>
-          <w:sz w:val="24"/>
-          <w:szCs w:val="24"/>
-        </w:rPr>
-        <w:t>toplam</w:t>
-      </w:r>
-      <w:r>
-        <w:rPr>
-          <w:bCs/>
-          <w:sz w:val="24"/>
-          <w:szCs w:val="24"/>
-        </w:rPr>
-        <w:t>_borc</w:t>
-      </w:r>
-      <w:r>
-        <w:rPr>
-          <w:bCs/>
-          <w:sz w:val="24"/>
-          <w:szCs w:val="24"/>
-        </w:rPr>
-        <w:t>_bakiye</w:t>
-      </w:r>
-      <w:proofErr w:type="spellEnd"/>
-      <w:r>
-        <w:rPr>
-          <w:bCs/>
-          <w:sz w:val="24"/>
-          <w:szCs w:val="24"/>
-        </w:rPr>
-        <w:t>}}</w:t>
-      </w:r>
-      <w:r>
-        <w:rPr>
-          <w:bCs/>
-          <w:sz w:val="24"/>
-          <w:szCs w:val="24"/>
-        </w:rPr>
-        <w:t xml:space="preserve"> TL borcunuz bulunmaktadır.</w:t>
-      </w:r>
-      <w:r>
-        <w:rPr>
-          <w:sz w:val="24"/>
-          <w:szCs w:val="24"/>
-        </w:rPr>
-        <w:t xml:space="preserve"> </w:t>
-      </w:r>
-    </w:p>
-    <w:p>
-      <w:pPr>
-        <w:pStyle w:val="Normal2"/>
-        <w:jc w:val="both"/>
-        <w:rPr>
           <w:sz w:val="24"/>
           <w:szCs w:val="24"/>
         </w:rPr>
@@ -897,83 +890,100 @@
       </w:pPr>
       <w:r>
         <w:rPr>
-          <w:bCs/>
-          <w:sz w:val="24"/>
-          <w:szCs w:val="24"/>
-        </w:rPr>
-        <w:t xml:space="preserve">Gerçekleşmiş bulunan temerrüdünüz sebebi </w:t>
+          <w:b/>
+          <w:sz w:val="24"/>
+          <w:szCs w:val="24"/>
+        </w:rPr>
+        <w:t>3.</w:t>
+      </w:r>
+      <w:r>
+        <w:rPr>
+          <w:bCs/>
+          <w:sz w:val="24"/>
+          <w:szCs w:val="24"/>
+        </w:rPr>
+        <w:t xml:space="preserve"> </w:t>
+      </w:r>
+      <w:bookmarkStart w:id="2" w:name="_Hlk68862300"/>
+      <w:r>
+        <w:rPr>
+          <w:bCs/>
+          <w:sz w:val="24"/>
+          <w:szCs w:val="24"/>
+        </w:rPr>
+        <w:t xml:space="preserve">Gerçekleşmiş bulunan temerrüdünüz sebebi ile; </w:t>
+      </w:r>
+      <w:r>
+        <w:rPr>
+          <w:bCs/>
+          <w:sz w:val="24"/>
+          <w:szCs w:val="24"/>
+        </w:rPr>
+        <w:t>i</w:t>
+      </w:r>
+      <w:r>
+        <w:rPr>
+          <w:sz w:val="24"/>
+          <w:szCs w:val="24"/>
+        </w:rPr>
+        <w:t xml:space="preserve">ş bu ihtarnameye konu borçlarınızın tümünü ihtarname masrafıyla birlikte, ihtarnamemizin tarafınıza tebliği veya tebliğ edilmiş sayıldığı tarihinden itibaren </w:t>
+      </w:r>
+      <w:r>
+        <w:rPr>
+          <w:b/>
+          <w:bCs/>
+          <w:sz w:val="24"/>
+          <w:szCs w:val="24"/>
+        </w:rPr>
+        <w:t>6</w:t>
+      </w:r>
+      <w:r>
+        <w:rPr>
+          <w:b/>
+          <w:bCs/>
+          <w:sz w:val="24"/>
+          <w:szCs w:val="24"/>
+        </w:rPr>
+        <w:t>0 gün</w:t>
+      </w:r>
+      <w:r>
+        <w:rPr>
+          <w:sz w:val="24"/>
+          <w:szCs w:val="24"/>
+        </w:rPr>
+        <w:t xml:space="preserve"> içinde, ihtar tarihinden itibaren sözleşme gereği işleyecek temerrüt </w:t>
+      </w:r>
+      <w:r>
+        <w:rPr>
+          <w:sz w:val="24"/>
+          <w:szCs w:val="24"/>
+        </w:rPr>
+        <w:t>masrafı</w:t>
+      </w:r>
+      <w:r>
+        <w:rPr>
+          <w:sz w:val="24"/>
+          <w:szCs w:val="24"/>
+        </w:rPr>
+        <w:t xml:space="preserve"> </w:t>
       </w:r>
       <w:proofErr w:type="gramStart"/>
       <w:r>
         <w:rPr>
-          <w:bCs/>
-          <w:sz w:val="24"/>
-          <w:szCs w:val="24"/>
-        </w:rPr>
-        <w:t>ile ;</w:t>
+          <w:sz w:val="24"/>
+          <w:szCs w:val="24"/>
+        </w:rPr>
+        <w:t>ile birlikte</w:t>
       </w:r>
       <w:proofErr w:type="gramEnd"/>
       <w:r>
         <w:rPr>
-          <w:bCs/>
-          <w:sz w:val="24"/>
-          <w:szCs w:val="24"/>
-        </w:rPr>
-        <w:t xml:space="preserve"> İ</w:t>
-      </w:r>
-      <w:r>
-        <w:rPr>
-          <w:sz w:val="24"/>
-          <w:szCs w:val="24"/>
-        </w:rPr>
-        <w:t xml:space="preserve">ş bu ihtarnameye konu borçlarınızın tümünü ihtarname masrafıyla birlikte, ihtarnamemizin tarafınıza tebliği veya tebliğ edilmiş sayıldığı tarihinden itibaren </w:t>
-      </w:r>
-      <w:r>
-        <w:rPr>
-          <w:b/>
-          <w:bCs/>
-          <w:sz w:val="24"/>
-          <w:szCs w:val="24"/>
-        </w:rPr>
-        <w:t>60 gün</w:t>
-      </w:r>
-      <w:r>
-        <w:rPr>
-          <w:sz w:val="24"/>
-          <w:szCs w:val="24"/>
-        </w:rPr>
-        <w:t xml:space="preserve"> içinde, ihtar tarihinden itibaren sözleşme gereği işleyecek temerrüt </w:t>
-      </w:r>
-      <w:r>
-        <w:rPr>
-          <w:sz w:val="24"/>
-          <w:szCs w:val="24"/>
-        </w:rPr>
-        <w:t>masrafı</w:t>
-      </w:r>
-      <w:r>
-        <w:rPr>
-          <w:sz w:val="24"/>
-          <w:szCs w:val="24"/>
-        </w:rPr>
-        <w:t xml:space="preserve"> </w:t>
-      </w:r>
-      <w:proofErr w:type="gramStart"/>
-      <w:r>
-        <w:rPr>
-          <w:sz w:val="24"/>
-          <w:szCs w:val="24"/>
-        </w:rPr>
-        <w:t>ile birlikte</w:t>
-      </w:r>
-      <w:proofErr w:type="gramEnd"/>
-      <w:r>
-        <w:rPr>
           <w:sz w:val="24"/>
           <w:szCs w:val="24"/>
         </w:rPr>
         <w:t xml:space="preserve"> ödemenizi,</w:t>
       </w:r>
+      <w:bookmarkEnd w:id="2"/>
     </w:p>
     <w:p>
       <w:pPr>
@@ -999,14 +1009,7 @@
           <w:sz w:val="24"/>
           <w:szCs w:val="24"/>
         </w:rPr>
-        <w:t>Borcunuzu yukarıda belirtilen şekilde ödemediğiniz taktirde,</w:t>
-      </w:r>
-      <w:r>
-        <w:rPr>
-          <w:sz w:val="24"/>
-          <w:szCs w:val="24"/>
-        </w:rPr>
-        <w:t xml:space="preserve"> </w:t>
+        <w:t xml:space="preserve">Borcunuzu yukarıda belirtilen şekilde ödemediğiniz taktirde, </w:t>
       </w:r>
     </w:p>
     <w:p>
@@ -1018,6 +1021,11 @@
           <w:sz w:val="24"/>
           <w:szCs w:val="24"/>
         </w:rPr>
+      </w:pPr>
+    </w:p>
+    <w:p>
+      <w:pPr>
+        <w:pStyle w:val="ListeParagraf"/>
       </w:pPr>
     </w:p>
     <w:p>
@@ -1033,6 +1041,7 @@
           <w:szCs w:val="24"/>
         </w:rPr>
       </w:pPr>
+      <w:bookmarkStart w:id="3" w:name="_Hlk219367559"/>
       <w:r>
         <w:rPr>
           <w:sz w:val="24"/>
@@ -1145,6 +1154,7 @@
         <w:t>bileceğimizi,</w:t>
       </w:r>
     </w:p>
+    <w:bookmarkEnd w:id="3"/>
     <w:p>
       <w:pPr>
         <w:pStyle w:val="ListeParagraf"/>
@@ -1163,28 +1173,48 @@
           <w:szCs w:val="24"/>
         </w:rPr>
       </w:pPr>
-      <w:r>
-        <w:rPr>
-          <w:sz w:val="24"/>
-          <w:szCs w:val="24"/>
-        </w:rPr>
-        <w:t xml:space="preserve">Veya borcunuzu yukarıda belirtilen şekilde ödemediğiniz taktirde; sözleşmeyi </w:t>
-      </w:r>
-      <w:proofErr w:type="gramStart"/>
-      <w:r>
-        <w:rPr>
-          <w:sz w:val="24"/>
-          <w:szCs w:val="24"/>
-        </w:rPr>
-        <w:t>fesih etmeden</w:t>
-      </w:r>
-      <w:proofErr w:type="gramEnd"/>
-      <w:r>
-        <w:rPr>
-          <w:sz w:val="24"/>
-          <w:szCs w:val="24"/>
-        </w:rPr>
-        <w:t xml:space="preserve"> henüz vadesi gelmeyen bakiye borçlarınızın tamamının muaccel kılacağımızı, bu halde bu </w:t>
+      <w:bookmarkStart w:id="4" w:name="_Hlk68862499"/>
+      <w:r>
+        <w:rPr>
+          <w:sz w:val="24"/>
+          <w:szCs w:val="24"/>
+        </w:rPr>
+        <w:t>Veya borcunuzu yukarıda belirtilen şekilde ödemediğiniz taktirde; sözleşmeyi fes</w:t>
+      </w:r>
+      <w:r>
+        <w:rPr>
+          <w:sz w:val="24"/>
+          <w:szCs w:val="24"/>
+        </w:rPr>
+        <w:t>h</w:t>
+      </w:r>
+      <w:r>
+        <w:rPr>
+          <w:sz w:val="24"/>
+          <w:szCs w:val="24"/>
+        </w:rPr>
+        <w:t>etmeden henüz vadesi gelmeyen bakiye borçlarınızın tamamının muaccel kıla</w:t>
+      </w:r>
+      <w:r>
+        <w:rPr>
+          <w:sz w:val="24"/>
+          <w:szCs w:val="24"/>
+        </w:rPr>
+        <w:t>bileceğimizi</w:t>
+      </w:r>
+      <w:r>
+        <w:rPr>
+          <w:sz w:val="24"/>
+          <w:szCs w:val="24"/>
+        </w:rPr>
+        <w:t>, bu halde bu</w:t>
+      </w:r>
+      <w:r>
+        <w:rPr>
+          <w:sz w:val="24"/>
+          <w:szCs w:val="24"/>
+        </w:rPr>
+        <w:t xml:space="preserve"> </w:t>
       </w:r>
       <w:r>
         <w:rPr>
@@ -1193,6 +1223,31 @@
         </w:rPr>
         <w:t>ihtarnamede belirtilen temerrüde düştüğünüz borçlarla birlikte muaccel kılınan borçlarınızın da tahsili için sözleşme ve ilgili mevzuatlar gereği yasal yollara müracaat edeceğimizi,</w:t>
       </w:r>
+    </w:p>
+    <w:p>
+      <w:pPr>
+        <w:pStyle w:val="ListeParagraf"/>
+      </w:pPr>
+    </w:p>
+    <w:p>
+      <w:pPr>
+        <w:pStyle w:val="Normal10"/>
+        <w:jc w:val="both"/>
+        <w:rPr>
+          <w:sz w:val="24"/>
+          <w:szCs w:val="24"/>
+        </w:rPr>
+      </w:pPr>
+    </w:p>
+    <w:p>
+      <w:pPr>
+        <w:pStyle w:val="Normal10"/>
+        <w:jc w:val="both"/>
+        <w:rPr>
+          <w:sz w:val="24"/>
+          <w:szCs w:val="24"/>
+        </w:rPr>
+      </w:pPr>
     </w:p>
     <w:p>
       <w:pPr>
@@ -1238,6 +1293,7 @@
         </w:rPr>
         <w:t xml:space="preserve">sözleşmenin ilgili maddesindeki hükümlerine göre sözleşmeden dönebileceğimizi,  </w:t>
       </w:r>
+      <w:bookmarkEnd w:id="4"/>
     </w:p>
     <w:p>
       <w:pPr>
@@ -1262,42 +1318,7 @@
           <w:sz w:val="24"/>
           <w:szCs w:val="24"/>
         </w:rPr>
-        <w:t>Veya yukarıda belirtilen seçimlik haklarından herhangi biri</w:t>
-      </w:r>
-      <w:r>
-        <w:rPr>
-          <w:sz w:val="24"/>
-          <w:szCs w:val="24"/>
-        </w:rPr>
-        <w:t>ni</w:t>
-      </w:r>
-      <w:r>
-        <w:rPr>
-          <w:sz w:val="24"/>
-          <w:szCs w:val="24"/>
-        </w:rPr>
-        <w:t xml:space="preserve"> seçmeyerek, </w:t>
-      </w:r>
-      <w:r>
-        <w:rPr>
-          <w:sz w:val="24"/>
-          <w:szCs w:val="24"/>
-        </w:rPr>
-        <w:t>i</w:t>
-      </w:r>
-      <w:r>
-        <w:rPr>
-          <w:sz w:val="24"/>
-          <w:szCs w:val="24"/>
-        </w:rPr>
-        <w:t xml:space="preserve">htar tarihinden itibaren 5 gün içinde ihtarnameye konu </w:t>
-      </w:r>
-      <w:r>
-        <w:rPr>
-          <w:sz w:val="24"/>
-          <w:szCs w:val="24"/>
-        </w:rPr>
-        <w:t xml:space="preserve">temerrüde düşen borçlarınızın ödenmemesi halinde yukarıda belirtilen </w:t>
+        <w:t xml:space="preserve">Veya yukarıda belirtilen seçimlik haklarından herhangi biri seçmeyerek, ihtar tarihinden itibaren 5 gün içinde ihtarnameye konu temerrüde düşen borçlarınızın ödenmemesi halinde, yukarıda belirtilen </w:t>
       </w:r>
       <w:r>
         <w:rPr>
@@ -1306,7 +1327,7 @@
           <w:sz w:val="24"/>
           <w:szCs w:val="24"/>
         </w:rPr>
-        <w:t>60</w:t>
+        <w:t>6</w:t>
       </w:r>
       <w:r>
         <w:rPr>
@@ -1315,67 +1336,28 @@
           <w:sz w:val="24"/>
           <w:szCs w:val="24"/>
         </w:rPr>
-        <w:t xml:space="preserve"> gün</w:t>
-      </w:r>
-      <w:r>
-        <w:rPr>
-          <w:b/>
-          <w:bCs/>
-          <w:sz w:val="24"/>
-          <w:szCs w:val="24"/>
-        </w:rPr>
-        <w:t>ü</w:t>
-      </w:r>
-      <w:r>
-        <w:rPr>
-          <w:b/>
-          <w:bCs/>
-          <w:sz w:val="24"/>
-          <w:szCs w:val="24"/>
-        </w:rPr>
-        <w:t xml:space="preserve"> </w:t>
-      </w:r>
-      <w:r>
-        <w:rPr>
-          <w:sz w:val="24"/>
-          <w:szCs w:val="24"/>
-        </w:rPr>
-        <w:t>bekle</w:t>
-      </w:r>
-      <w:r>
-        <w:rPr>
-          <w:sz w:val="24"/>
-          <w:szCs w:val="24"/>
-        </w:rPr>
-        <w:t>m</w:t>
-      </w:r>
-      <w:r>
-        <w:rPr>
-          <w:sz w:val="24"/>
-          <w:szCs w:val="24"/>
-        </w:rPr>
-        <w:t>eksizin</w:t>
-      </w:r>
-      <w:r>
-        <w:rPr>
-          <w:sz w:val="24"/>
-          <w:szCs w:val="24"/>
-        </w:rPr>
-        <w:t xml:space="preserve"> bu alacağımızın </w:t>
-      </w:r>
-      <w:r>
-        <w:rPr>
-          <w:sz w:val="24"/>
-          <w:szCs w:val="24"/>
-        </w:rPr>
-        <w:t>tahsili için yasal yollara müracaat ed</w:t>
-      </w:r>
-      <w:r>
-        <w:rPr>
-          <w:sz w:val="24"/>
-          <w:szCs w:val="24"/>
-        </w:rPr>
-        <w:t>eceğimizi,</w:t>
+        <w:t>0 günü</w:t>
+      </w:r>
+      <w:r>
+        <w:rPr>
+          <w:sz w:val="24"/>
+          <w:szCs w:val="24"/>
+        </w:rPr>
+        <w:t xml:space="preserve"> beklemeden bu alacağımızın tahsili için yasal yollara müracaat ede</w:t>
+      </w:r>
+      <w:r>
+        <w:rPr>
+          <w:sz w:val="24"/>
+          <w:szCs w:val="24"/>
+        </w:rPr>
+        <w:t>bile</w:t>
+      </w:r>
+      <w:r>
+        <w:rPr>
+          <w:sz w:val="24"/>
+          <w:szCs w:val="24"/>
+        </w:rPr>
+        <w:t>ceğimizi,</w:t>
       </w:r>
     </w:p>
     <w:p>
@@ -1391,6 +1373,10 @@
           <w:numId w:val="4"/>
         </w:numPr>
         <w:jc w:val="both"/>
+        <w:rPr>
+          <w:sz w:val="24"/>
+          <w:szCs w:val="24"/>
+        </w:rPr>
       </w:pPr>
       <w:r>
         <w:rPr>
@@ -1411,14 +1397,7 @@
           <w:sz w:val="24"/>
           <w:szCs w:val="24"/>
         </w:rPr>
-        <w:t>şekilde seçe</w:t>
-      </w:r>
-      <w:r>
-        <w:rPr>
-          <w:sz w:val="24"/>
-          <w:szCs w:val="24"/>
-        </w:rPr>
-        <w:t>rek uygula</w:t>
+        <w:t>şekilde seçerek uygula</w:t>
       </w:r>
       <w:r>
         <w:rPr>
@@ -1436,56 +1415,60 @@
     <w:p>
       <w:pPr>
         <w:pStyle w:val="Normal10"/>
+        <w:jc w:val="both"/>
+        <w:rPr>
+          <w:sz w:val="24"/>
+          <w:szCs w:val="24"/>
+        </w:rPr>
+      </w:pPr>
+      <w:proofErr w:type="gramStart"/>
+      <w:r>
+        <w:rPr>
+          <w:sz w:val="24"/>
+          <w:szCs w:val="24"/>
+        </w:rPr>
+        <w:t>i</w:t>
+      </w:r>
+      <w:r>
+        <w:rPr>
+          <w:sz w:val="24"/>
+          <w:szCs w:val="24"/>
+        </w:rPr>
+        <w:t>htar</w:t>
+      </w:r>
+      <w:proofErr w:type="gramEnd"/>
+      <w:r>
+        <w:rPr>
+          <w:sz w:val="24"/>
+          <w:szCs w:val="24"/>
+        </w:rPr>
+        <w:t xml:space="preserve"> ve ihbar ederiz.</w:t>
+      </w:r>
+    </w:p>
+    <w:p>
+      <w:pPr>
+        <w:pStyle w:val="Normal2"/>
+        <w:jc w:val="both"/>
+        <w:rPr>
+          <w:sz w:val="24"/>
+          <w:szCs w:val="24"/>
+        </w:rPr>
+      </w:pPr>
+    </w:p>
+    <w:p>
+      <w:pPr>
+        <w:pStyle w:val="Normal2"/>
         <w:ind w:left="720"/>
         <w:jc w:val="both"/>
-      </w:pPr>
-    </w:p>
-    <w:p>
-      <w:pPr>
-        <w:pStyle w:val="Normal10"/>
-        <w:jc w:val="both"/>
-        <w:rPr>
-          <w:sz w:val="24"/>
-          <w:szCs w:val="24"/>
-        </w:rPr>
-      </w:pPr>
-      <w:proofErr w:type="gramStart"/>
-      <w:r>
-        <w:rPr>
-          <w:sz w:val="24"/>
-          <w:szCs w:val="24"/>
-        </w:rPr>
-        <w:t>i</w:t>
-      </w:r>
-      <w:r>
-        <w:rPr>
-          <w:sz w:val="24"/>
-          <w:szCs w:val="24"/>
-        </w:rPr>
-        <w:t>htar</w:t>
-      </w:r>
-      <w:proofErr w:type="gramEnd"/>
-      <w:r>
-        <w:rPr>
-          <w:sz w:val="24"/>
-          <w:szCs w:val="24"/>
-        </w:rPr>
-        <w:t xml:space="preserve"> ve ihbar ederiz.</w:t>
-      </w:r>
-    </w:p>
-    <w:p>
-      <w:pPr>
-        <w:pStyle w:val="Normal2"/>
-        <w:jc w:val="both"/>
-        <w:rPr>
-          <w:sz w:val="24"/>
-          <w:szCs w:val="24"/>
-        </w:rPr>
-      </w:pPr>
-    </w:p>
-    <w:p>
-      <w:pPr>
-        <w:pStyle w:val="Normal2"/>
+        <w:rPr>
+          <w:sz w:val="24"/>
+          <w:szCs w:val="24"/>
+        </w:rPr>
+      </w:pPr>
+    </w:p>
+    <w:p>
+      <w:pPr>
+        <w:pStyle w:val="Normal20"/>
         <w:ind w:left="6372" w:firstLine="708"/>
         <w:jc w:val="both"/>
         <w:rPr>
@@ -1503,8 +1486,141 @@
     </w:p>
     <w:p>
       <w:pPr>
+        <w:pStyle w:val="Normal20"/>
+        <w:jc w:val="both"/>
+        <w:rPr>
+          <w:sz w:val="24"/>
+          <w:szCs w:val="24"/>
+        </w:rPr>
+      </w:pPr>
+      <w:r>
+        <w:rPr>
+          <w:sz w:val="24"/>
+          <w:szCs w:val="24"/>
+        </w:rPr>
+        <w:t xml:space="preserve">                                                                                                   </w:t>
+      </w:r>
+      <w:r>
+        <w:rPr>
+          <w:sz w:val="24"/>
+          <w:szCs w:val="24"/>
+        </w:rPr>
+        <w:t>ARI</w:t>
+      </w:r>
+      <w:r>
+        <w:rPr>
+          <w:sz w:val="24"/>
+          <w:szCs w:val="24"/>
+        </w:rPr>
+        <w:t xml:space="preserve"> </w:t>
+      </w:r>
+      <w:r>
+        <w:rPr>
+          <w:sz w:val="24"/>
+          <w:szCs w:val="24"/>
+        </w:rPr>
+        <w:t>FİNANSAL KİRALAMA</w:t>
+      </w:r>
+      <w:r>
+        <w:rPr>
+          <w:sz w:val="24"/>
+          <w:szCs w:val="24"/>
+        </w:rPr>
+        <w:t xml:space="preserve"> </w:t>
+      </w:r>
+      <w:r>
+        <w:rPr>
+          <w:sz w:val="24"/>
+          <w:szCs w:val="24"/>
+        </w:rPr>
+        <w:t xml:space="preserve">A.Ş. </w:t>
+      </w:r>
+    </w:p>
+    <w:p>
+      <w:pPr>
+        <w:pStyle w:val="Normal20"/>
+        <w:jc w:val="both"/>
+        <w:rPr>
+          <w:sz w:val="24"/>
+          <w:szCs w:val="24"/>
+        </w:rPr>
+      </w:pPr>
+    </w:p>
+    <w:p>
+      <w:pPr>
+        <w:pStyle w:val="Normal20"/>
+        <w:jc w:val="both"/>
+        <w:rPr>
+          <w:sz w:val="24"/>
+          <w:szCs w:val="24"/>
+        </w:rPr>
+      </w:pPr>
+    </w:p>
+    <w:p>
+      <w:pPr>
+        <w:pStyle w:val="Normal20"/>
+        <w:jc w:val="both"/>
+        <w:rPr>
+          <w:sz w:val="24"/>
+          <w:szCs w:val="24"/>
+        </w:rPr>
+      </w:pPr>
+    </w:p>
+    <w:p>
+      <w:pPr>
+        <w:pStyle w:val="Normal20"/>
+        <w:jc w:val="both"/>
+        <w:rPr>
+          <w:sz w:val="24"/>
+          <w:szCs w:val="24"/>
+        </w:rPr>
+      </w:pPr>
+    </w:p>
+    <w:p>
+      <w:pPr>
+        <w:pStyle w:val="Normal20"/>
+        <w:jc w:val="both"/>
+        <w:rPr>
+          <w:sz w:val="24"/>
+          <w:szCs w:val="24"/>
+        </w:rPr>
+      </w:pPr>
+    </w:p>
+    <w:p>
+      <w:pPr>
+        <w:pStyle w:val="Normal20"/>
+        <w:widowControl w:val="0"/>
+        <w:autoSpaceDE w:val="0"/>
+        <w:autoSpaceDN w:val="0"/>
+        <w:adjustRightInd w:val="0"/>
+        <w:ind w:left="5238" w:right="-20"/>
+        <w:rPr>
+          <w:sz w:val="24"/>
+          <w:szCs w:val="24"/>
+        </w:rPr>
+      </w:pPr>
+    </w:p>
+    <w:p>
+      <w:pPr>
         <w:pStyle w:val="Normal2"/>
-        <w:ind w:left="5664"/>
+        <w:rPr>
+          <w:sz w:val="24"/>
+          <w:szCs w:val="24"/>
+        </w:rPr>
+      </w:pPr>
+    </w:p>
+    <w:p>
+      <w:pPr>
+        <w:pStyle w:val="Normal2"/>
+        <w:rPr>
+          <w:sz w:val="24"/>
+          <w:szCs w:val="24"/>
+        </w:rPr>
+      </w:pPr>
+    </w:p>
+    <w:p>
+      <w:pPr>
+        <w:pStyle w:val="Normal200"/>
         <w:jc w:val="both"/>
         <w:rPr>
           <w:sz w:val="24"/>
@@ -1516,18 +1632,35 @@
           <w:sz w:val="24"/>
           <w:szCs w:val="24"/>
         </w:rPr>
-        <w:t xml:space="preserve">ARI FİNANSAL KİRALAMA A.Ş. </w:t>
-      </w:r>
-    </w:p>
-    <w:p>
-      <w:pPr>
-        <w:pStyle w:val="Normal2"/>
+        <w:t xml:space="preserve">Sayın Noter, </w:t>
+      </w:r>
+    </w:p>
+    <w:p>
+      <w:pPr>
+        <w:pStyle w:val="Normal200"/>
         <w:jc w:val="both"/>
         <w:rPr>
           <w:sz w:val="24"/>
           <w:szCs w:val="24"/>
         </w:rPr>
       </w:pPr>
+    </w:p>
+    <w:p>
+      <w:pPr>
+        <w:pStyle w:val="Normal200"/>
+        <w:jc w:val="both"/>
+        <w:rPr>
+          <w:sz w:val="24"/>
+          <w:szCs w:val="24"/>
+        </w:rPr>
+      </w:pPr>
+      <w:r>
+        <w:rPr>
+          <w:sz w:val="24"/>
+          <w:szCs w:val="24"/>
+        </w:rPr>
+        <w:t>3 nüshadan ibaret işbu ihtarnamenin bir suretini karşı tarafa e-tebligat yoksa hızlı posta ile tebliğini, tebliğ şerhi taşıyan bir suretinin tarafıma verilmesini, diğer suretinin dairenizde saklanmasını saygılarımla talep ederim.</w:t>
+      </w:r>
     </w:p>
     <w:p>
       <w:pPr>
@@ -1584,6 +1717,7 @@
         </w:rPr>
       </w:pPr>
     </w:p>
+    <w:p/>
     <w:sectPr>
       <w:pgSz w:w="11906" w:h="16838"/>
       <w:pgMar w:top="1417" w:right="1133" w:bottom="1417" w:left="1134" w:header="708" w:footer="708" w:gutter="0"/>
@@ -2664,6 +2798,16 @@
       <w:szCs w:val="24"/>
     </w:rPr>
   </w:style>
+  <w:style w:type="paragraph" w:customStyle="1" w:styleId="Normal20">
+    <w:name w:val="Normal_2_0"/>
+    <w:qFormat/>
+    <w:rsid w:val="005327E9"/>
+  </w:style>
+  <w:style w:type="paragraph" w:customStyle="1" w:styleId="Normal200">
+    <w:name w:val="Normal_2_0_0"/>
+    <w:qFormat/>
+    <w:rsid w:val="005327E9"/>
+  </w:style>
 </w:styles>
 </file>
 

</xml_diff>

<commit_message>
#260210 fix: fixed global settings
</commit_message>
<xml_diff>
--- a/files/ihtar-ticari.docx
+++ b/files/ihtar-ticari.docx
@@ -5,266 +5,605 @@
     <w:p>
       <w:pPr>
         <w:rPr>
-          <w:sz w:val="24"/>
-          <w:szCs w:val="24"/>
-        </w:rPr>
-      </w:pPr>
-      <w:r>
-        <w:t>Sayın</w:t>
-      </w:r>
-      <w:r>
-        <w:t xml:space="preserve"> </w:t>
-      </w:r>
-      <w:r>
-        <w:rPr>
-          <w:sz w:val="24"/>
-          <w:szCs w:val="24"/>
-        </w:rPr>
-        <w:t>{{isim}} ({{</w:t>
-      </w:r>
-      <w:proofErr w:type="spellStart"/>
-      <w:r>
-        <w:rPr>
-          <w:sz w:val="24"/>
-          <w:szCs w:val="24"/>
-        </w:rPr>
-        <w:t>tc_vkn_no</w:t>
-      </w:r>
-      <w:proofErr w:type="spellEnd"/>
-      <w:r>
-        <w:rPr>
-          <w:sz w:val="24"/>
-          <w:szCs w:val="24"/>
-        </w:rPr>
-        <w:t>}})</w:t>
-      </w:r>
+          <w:rFonts w:ascii="Times New Roman" w:hAnsi="Times New Roman" w:cs="Times New Roman"/>
+          <w:sz w:val="24"/>
+          <w:szCs w:val="24"/>
+        </w:rPr>
+      </w:pPr>
     </w:p>
     <w:p>
       <w:pPr>
-        <w:pStyle w:val="Normal2"/>
-        <w:rPr>
-          <w:sz w:val="24"/>
-          <w:szCs w:val="24"/>
-        </w:rPr>
-      </w:pPr>
-      <w:r>
-        <w:rPr>
-          <w:sz w:val="24"/>
-          <w:szCs w:val="24"/>
-        </w:rPr>
-        <w:t>{{adres}}</w:t>
-      </w:r>
-    </w:p>
-    <w:p/>
-    <w:p>
-      <w:pPr>
-        <w:jc w:val="both"/>
-      </w:pPr>
-      <w:r>
-        <w:t xml:space="preserve">Bildiğiniz gibi, sizinle aramızda, </w:t>
-      </w:r>
-      <w:r>
-        <w:t>aşağıda</w:t>
-      </w:r>
-      <w:r>
-        <w:t xml:space="preserve"> (sözleşme hakkında not </w:t>
-      </w:r>
-      <w:r>
-        <w:t>başlığı altında</w:t>
-      </w:r>
-      <w:r>
-        <w:t>)</w:t>
-      </w:r>
-      <w:r>
-        <w:t xml:space="preserve"> </w:t>
-      </w:r>
-      <w:r>
-        <w:t xml:space="preserve">tarihi ve numarası yazılı finansal kiralama sözleşmesi imzalanmıştır. Bu sözleşmeye göre ödenmesi gereken </w:t>
-      </w:r>
-      <w:proofErr w:type="gramStart"/>
-      <w:r>
-        <w:t>taksitlerinizden</w:t>
-      </w:r>
-      <w:r>
-        <w:t>,</w:t>
-      </w:r>
-      <w:r>
-        <w:t xml:space="preserve">  aşağıda</w:t>
-      </w:r>
-      <w:proofErr w:type="gramEnd"/>
-      <w:r>
-        <w:t xml:space="preserve"> vadesi ve tutarı yazılı olan taksitiniz /taksitleriniz</w:t>
-      </w:r>
-      <w:r>
-        <w:t>,</w:t>
-      </w:r>
-      <w:r>
-        <w:t xml:space="preserve"> bu yazımız tarihi itibariyle, vadesinde ödenmemiş</w:t>
-      </w:r>
-      <w:r>
-        <w:t>tir.</w:t>
-      </w:r>
-      <w:r>
-        <w:t xml:space="preserve"> </w:t>
+        <w:rPr>
+          <w:rFonts w:ascii="Times New Roman" w:hAnsi="Times New Roman" w:cs="Times New Roman"/>
+          <w:sz w:val="24"/>
+          <w:szCs w:val="24"/>
+        </w:rPr>
+      </w:pPr>
+      <w:r>
+        <w:rPr>
+          <w:rFonts w:ascii="Times New Roman" w:hAnsi="Times New Roman" w:cs="Times New Roman"/>
+          <w:sz w:val="24"/>
+          <w:szCs w:val="24"/>
+        </w:rPr>
+        <w:t>Sayın</w:t>
+      </w:r>
+      <w:r>
+        <w:rPr>
+          <w:rFonts w:ascii="Times New Roman" w:hAnsi="Times New Roman" w:cs="Times New Roman"/>
+          <w:sz w:val="24"/>
+          <w:szCs w:val="24"/>
+        </w:rPr>
+        <w:t xml:space="preserve"> {{isim}} ({{</w:t>
+      </w:r>
+      <w:proofErr w:type="spellStart"/>
+      <w:r>
+        <w:rPr>
+          <w:rFonts w:ascii="Times New Roman" w:hAnsi="Times New Roman" w:cs="Times New Roman"/>
+          <w:sz w:val="24"/>
+          <w:szCs w:val="24"/>
+        </w:rPr>
+        <w:t>tc_vkn_no</w:t>
+      </w:r>
+      <w:proofErr w:type="spellEnd"/>
+      <w:r>
+        <w:rPr>
+          <w:rFonts w:ascii="Times New Roman" w:hAnsi="Times New Roman" w:cs="Times New Roman"/>
+          <w:sz w:val="24"/>
+          <w:szCs w:val="24"/>
+        </w:rPr>
+        <w:t>}})</w:t>
       </w:r>
     </w:p>
     <w:p>
       <w:pPr>
+        <w:pStyle w:val="Normal2"/>
+        <w:rPr>
+          <w:sz w:val="24"/>
+          <w:szCs w:val="24"/>
+        </w:rPr>
+      </w:pPr>
+      <w:r>
+        <w:rPr>
+          <w:sz w:val="24"/>
+          <w:szCs w:val="24"/>
+        </w:rPr>
+        <w:t>{{adres}}</w:t>
+      </w:r>
+    </w:p>
+    <w:p>
+      <w:pPr>
+        <w:rPr>
+          <w:rFonts w:ascii="Times New Roman" w:hAnsi="Times New Roman" w:cs="Times New Roman"/>
+          <w:sz w:val="24"/>
+          <w:szCs w:val="24"/>
+        </w:rPr>
+      </w:pPr>
+    </w:p>
+    <w:p>
+      <w:pPr>
         <w:jc w:val="both"/>
-      </w:pPr>
-      <w:r>
+        <w:rPr>
+          <w:rFonts w:ascii="Times New Roman" w:hAnsi="Times New Roman" w:cs="Times New Roman"/>
+          <w:sz w:val="24"/>
+          <w:szCs w:val="24"/>
+        </w:rPr>
+      </w:pPr>
+      <w:r>
+        <w:rPr>
+          <w:rFonts w:ascii="Times New Roman" w:hAnsi="Times New Roman" w:cs="Times New Roman"/>
+          <w:sz w:val="24"/>
+          <w:szCs w:val="24"/>
+        </w:rPr>
+        <w:t>Bildiğiniz gibi, sizinle aramızda, aşağıda</w:t>
+      </w:r>
+      <w:r>
+        <w:rPr>
+          <w:rFonts w:ascii="Times New Roman" w:hAnsi="Times New Roman" w:cs="Times New Roman"/>
+          <w:sz w:val="24"/>
+          <w:szCs w:val="24"/>
+        </w:rPr>
+        <w:t xml:space="preserve"> (sözleşme hakkında not </w:t>
+      </w:r>
+      <w:r>
+        <w:rPr>
+          <w:rFonts w:ascii="Times New Roman" w:hAnsi="Times New Roman" w:cs="Times New Roman"/>
+          <w:sz w:val="24"/>
+          <w:szCs w:val="24"/>
+        </w:rPr>
+        <w:t>başlığı altında</w:t>
+      </w:r>
+      <w:r>
+        <w:rPr>
+          <w:rFonts w:ascii="Times New Roman" w:hAnsi="Times New Roman" w:cs="Times New Roman"/>
+          <w:sz w:val="24"/>
+          <w:szCs w:val="24"/>
+        </w:rPr>
+        <w:t>)</w:t>
+      </w:r>
+      <w:r>
+        <w:rPr>
+          <w:rFonts w:ascii="Times New Roman" w:hAnsi="Times New Roman" w:cs="Times New Roman"/>
+          <w:sz w:val="24"/>
+          <w:szCs w:val="24"/>
+        </w:rPr>
+        <w:t xml:space="preserve"> tarihi ve numarası yazılı finansal kiralama sözleşmesi imzalanmıştır. Bu sözleşmeye göre ödenmesi gereken </w:t>
+      </w:r>
+      <w:proofErr w:type="gramStart"/>
+      <w:r>
+        <w:rPr>
+          <w:rFonts w:ascii="Times New Roman" w:hAnsi="Times New Roman" w:cs="Times New Roman"/>
+          <w:sz w:val="24"/>
+          <w:szCs w:val="24"/>
+        </w:rPr>
+        <w:t>taksitlerinizden</w:t>
+      </w:r>
+      <w:r>
+        <w:rPr>
+          <w:rFonts w:ascii="Times New Roman" w:hAnsi="Times New Roman" w:cs="Times New Roman"/>
+          <w:sz w:val="24"/>
+          <w:szCs w:val="24"/>
+        </w:rPr>
+        <w:t>,</w:t>
+      </w:r>
+      <w:r>
+        <w:rPr>
+          <w:rFonts w:ascii="Times New Roman" w:hAnsi="Times New Roman" w:cs="Times New Roman"/>
+          <w:sz w:val="24"/>
+          <w:szCs w:val="24"/>
+        </w:rPr>
+        <w:t xml:space="preserve">  aşağıda</w:t>
+      </w:r>
+      <w:proofErr w:type="gramEnd"/>
+      <w:r>
+        <w:rPr>
+          <w:rFonts w:ascii="Times New Roman" w:hAnsi="Times New Roman" w:cs="Times New Roman"/>
+          <w:sz w:val="24"/>
+          <w:szCs w:val="24"/>
+        </w:rPr>
+        <w:t xml:space="preserve"> vadesi ve tutarı yazılı olan taksitiniz /taksitleriniz</w:t>
+      </w:r>
+      <w:r>
+        <w:rPr>
+          <w:rFonts w:ascii="Times New Roman" w:hAnsi="Times New Roman" w:cs="Times New Roman"/>
+          <w:sz w:val="24"/>
+          <w:szCs w:val="24"/>
+        </w:rPr>
+        <w:t>,</w:t>
+      </w:r>
+      <w:r>
+        <w:rPr>
+          <w:rFonts w:ascii="Times New Roman" w:hAnsi="Times New Roman" w:cs="Times New Roman"/>
+          <w:sz w:val="24"/>
+          <w:szCs w:val="24"/>
+        </w:rPr>
+        <w:t xml:space="preserve"> bu yazımız tarihi itibariyle, vadesinde ödenmemiş</w:t>
+      </w:r>
+      <w:r>
+        <w:rPr>
+          <w:rFonts w:ascii="Times New Roman" w:hAnsi="Times New Roman" w:cs="Times New Roman"/>
+          <w:sz w:val="24"/>
+          <w:szCs w:val="24"/>
+        </w:rPr>
+        <w:t>tir.</w:t>
+      </w:r>
+      <w:r>
+        <w:rPr>
+          <w:rFonts w:ascii="Times New Roman" w:hAnsi="Times New Roman" w:cs="Times New Roman"/>
+          <w:sz w:val="24"/>
+          <w:szCs w:val="24"/>
+        </w:rPr>
+        <w:t xml:space="preserve"> </w:t>
+      </w:r>
+    </w:p>
+    <w:p>
+      <w:pPr>
+        <w:jc w:val="both"/>
+        <w:rPr>
+          <w:rFonts w:ascii="Times New Roman" w:hAnsi="Times New Roman" w:cs="Times New Roman"/>
+          <w:sz w:val="24"/>
+          <w:szCs w:val="24"/>
+        </w:rPr>
+      </w:pPr>
+      <w:r>
+        <w:rPr>
+          <w:rFonts w:ascii="Times New Roman" w:hAnsi="Times New Roman" w:cs="Times New Roman"/>
+          <w:sz w:val="24"/>
+          <w:szCs w:val="24"/>
+        </w:rPr>
         <w:t>S</w:t>
       </w:r>
       <w:r>
+        <w:rPr>
+          <w:rFonts w:ascii="Times New Roman" w:hAnsi="Times New Roman" w:cs="Times New Roman"/>
+          <w:sz w:val="24"/>
+          <w:szCs w:val="24"/>
+        </w:rPr>
         <w:t>izinle yürüttüğümüz karşılıklı güvene dayalı ilişkimizi sağlıklı ve kalıcı şekilde sürdürebilmek için</w:t>
       </w:r>
       <w:r>
+        <w:rPr>
+          <w:rFonts w:ascii="Times New Roman" w:hAnsi="Times New Roman" w:cs="Times New Roman"/>
+          <w:sz w:val="24"/>
+          <w:szCs w:val="24"/>
+        </w:rPr>
         <w:t>,</w:t>
       </w:r>
       <w:r>
+        <w:rPr>
+          <w:rFonts w:ascii="Times New Roman" w:hAnsi="Times New Roman" w:cs="Times New Roman"/>
+          <w:sz w:val="24"/>
+          <w:szCs w:val="24"/>
+        </w:rPr>
         <w:t xml:space="preserve"> </w:t>
       </w:r>
       <w:r>
+        <w:rPr>
+          <w:rFonts w:ascii="Times New Roman" w:hAnsi="Times New Roman" w:cs="Times New Roman"/>
+          <w:sz w:val="24"/>
+          <w:szCs w:val="24"/>
+        </w:rPr>
         <w:t>“</w:t>
       </w:r>
       <w:r>
+        <w:rPr>
+          <w:rFonts w:ascii="Times New Roman" w:hAnsi="Times New Roman" w:cs="Times New Roman"/>
+          <w:sz w:val="24"/>
+          <w:szCs w:val="24"/>
+        </w:rPr>
         <w:t>sözleşme hakkında not b) maddesinde yazılı tutarlar toplamını</w:t>
       </w:r>
       <w:r>
+        <w:rPr>
+          <w:rFonts w:ascii="Times New Roman" w:hAnsi="Times New Roman" w:cs="Times New Roman"/>
+          <w:sz w:val="24"/>
+          <w:szCs w:val="24"/>
+        </w:rPr>
         <w:t>”</w:t>
       </w:r>
       <w:r>
+        <w:rPr>
+          <w:rFonts w:ascii="Times New Roman" w:hAnsi="Times New Roman" w:cs="Times New Roman"/>
+          <w:sz w:val="24"/>
+          <w:szCs w:val="24"/>
+        </w:rPr>
         <w:t xml:space="preserve"> </w:t>
       </w:r>
       <w:r>
+        <w:rPr>
+          <w:rFonts w:ascii="Times New Roman" w:hAnsi="Times New Roman" w:cs="Times New Roman"/>
+          <w:sz w:val="24"/>
+          <w:szCs w:val="24"/>
+        </w:rPr>
         <w:t xml:space="preserve"> en kısa süre içerisinde </w:t>
       </w:r>
       <w:r>
+        <w:rPr>
+          <w:rFonts w:ascii="Times New Roman" w:hAnsi="Times New Roman" w:cs="Times New Roman"/>
+          <w:sz w:val="24"/>
+          <w:szCs w:val="24"/>
+        </w:rPr>
         <w:t>ödemeniz</w:t>
       </w:r>
       <w:r>
+        <w:rPr>
+          <w:rFonts w:ascii="Times New Roman" w:hAnsi="Times New Roman" w:cs="Times New Roman"/>
+          <w:sz w:val="24"/>
+          <w:szCs w:val="24"/>
+        </w:rPr>
         <w:t xml:space="preserve"> gereğini bilgilerinize iletir; ayrıca işbu </w:t>
       </w:r>
       <w:r>
+        <w:rPr>
+          <w:rFonts w:ascii="Times New Roman" w:hAnsi="Times New Roman" w:cs="Times New Roman"/>
+          <w:sz w:val="24"/>
+          <w:szCs w:val="24"/>
+        </w:rPr>
         <w:t>y</w:t>
       </w:r>
       <w:r>
+        <w:rPr>
+          <w:rFonts w:ascii="Times New Roman" w:hAnsi="Times New Roman" w:cs="Times New Roman"/>
+          <w:sz w:val="24"/>
+          <w:szCs w:val="24"/>
+        </w:rPr>
         <w:t>azımız tarihinden itibaren</w:t>
       </w:r>
       <w:r>
+        <w:rPr>
+          <w:rFonts w:ascii="Times New Roman" w:hAnsi="Times New Roman" w:cs="Times New Roman"/>
+          <w:sz w:val="24"/>
+          <w:szCs w:val="24"/>
+        </w:rPr>
         <w:t xml:space="preserve"> 60</w:t>
       </w:r>
       <w:r>
+        <w:rPr>
+          <w:rFonts w:ascii="Times New Roman" w:hAnsi="Times New Roman" w:cs="Times New Roman"/>
+          <w:sz w:val="24"/>
+          <w:szCs w:val="24"/>
+        </w:rPr>
         <w:t xml:space="preserve"> gün içinde</w:t>
       </w:r>
       <w:r>
+        <w:rPr>
+          <w:rFonts w:ascii="Times New Roman" w:hAnsi="Times New Roman" w:cs="Times New Roman"/>
+          <w:sz w:val="24"/>
+          <w:szCs w:val="24"/>
+        </w:rPr>
         <w:t xml:space="preserve"> aşağıda</w:t>
       </w:r>
       <w:r>
+        <w:rPr>
+          <w:rFonts w:ascii="Times New Roman" w:hAnsi="Times New Roman" w:cs="Times New Roman"/>
+          <w:sz w:val="24"/>
+          <w:szCs w:val="24"/>
+        </w:rPr>
         <w:t xml:space="preserve"> </w:t>
       </w:r>
       <w:r>
+        <w:rPr>
+          <w:rFonts w:ascii="Times New Roman" w:hAnsi="Times New Roman" w:cs="Times New Roman"/>
+          <w:sz w:val="24"/>
+          <w:szCs w:val="24"/>
+        </w:rPr>
         <w:t xml:space="preserve">“sözleşme hakkında not b) maddesinde” </w:t>
       </w:r>
       <w:r>
+        <w:rPr>
+          <w:rFonts w:ascii="Times New Roman" w:hAnsi="Times New Roman" w:cs="Times New Roman"/>
+          <w:sz w:val="24"/>
+          <w:szCs w:val="24"/>
+        </w:rPr>
         <w:t xml:space="preserve"> belirtilen</w:t>
       </w:r>
       <w:r>
+        <w:rPr>
+          <w:rFonts w:ascii="Times New Roman" w:hAnsi="Times New Roman" w:cs="Times New Roman"/>
+          <w:sz w:val="24"/>
+          <w:szCs w:val="24"/>
+        </w:rPr>
         <w:t xml:space="preserve"> </w:t>
       </w:r>
       <w:r>
+        <w:rPr>
+          <w:rFonts w:ascii="Times New Roman" w:hAnsi="Times New Roman" w:cs="Times New Roman"/>
+          <w:sz w:val="24"/>
+          <w:szCs w:val="24"/>
+        </w:rPr>
         <w:t>gecik</w:t>
       </w:r>
       <w:r>
+        <w:rPr>
+          <w:rFonts w:ascii="Times New Roman" w:hAnsi="Times New Roman" w:cs="Times New Roman"/>
+          <w:sz w:val="24"/>
+          <w:szCs w:val="24"/>
+        </w:rPr>
         <w:t>miş</w:t>
       </w:r>
       <w:r>
+        <w:rPr>
+          <w:rFonts w:ascii="Times New Roman" w:hAnsi="Times New Roman" w:cs="Times New Roman"/>
+          <w:sz w:val="24"/>
+          <w:szCs w:val="24"/>
+        </w:rPr>
         <w:t xml:space="preserve"> taksit tutarınızı</w:t>
       </w:r>
       <w:r>
+        <w:rPr>
+          <w:rFonts w:ascii="Times New Roman" w:hAnsi="Times New Roman" w:cs="Times New Roman"/>
+          <w:sz w:val="24"/>
+          <w:szCs w:val="24"/>
+        </w:rPr>
         <w:t xml:space="preserve"> </w:t>
       </w:r>
       <w:r>
+        <w:rPr>
+          <w:rFonts w:ascii="Times New Roman" w:hAnsi="Times New Roman" w:cs="Times New Roman"/>
+          <w:sz w:val="24"/>
+          <w:szCs w:val="24"/>
+        </w:rPr>
         <w:t xml:space="preserve">, </w:t>
       </w:r>
       <w:r>
+        <w:rPr>
+          <w:rFonts w:ascii="Times New Roman" w:hAnsi="Times New Roman" w:cs="Times New Roman"/>
+          <w:sz w:val="24"/>
+          <w:szCs w:val="24"/>
+        </w:rPr>
         <w:t xml:space="preserve">buna ilave olarak, </w:t>
       </w:r>
       <w:r>
+        <w:rPr>
+          <w:rFonts w:ascii="Times New Roman" w:hAnsi="Times New Roman" w:cs="Times New Roman"/>
+          <w:sz w:val="24"/>
+          <w:szCs w:val="24"/>
+        </w:rPr>
         <w:t xml:space="preserve">yine aşağıda yazılı </w:t>
       </w:r>
       <w:proofErr w:type="spellStart"/>
       <w:r>
+        <w:rPr>
+          <w:rFonts w:ascii="Times New Roman" w:hAnsi="Times New Roman" w:cs="Times New Roman"/>
+          <w:sz w:val="24"/>
+          <w:szCs w:val="24"/>
+        </w:rPr>
         <w:t>maktuen</w:t>
       </w:r>
       <w:proofErr w:type="spellEnd"/>
       <w:r>
+        <w:rPr>
+          <w:rFonts w:ascii="Times New Roman" w:hAnsi="Times New Roman" w:cs="Times New Roman"/>
+          <w:sz w:val="24"/>
+          <w:szCs w:val="24"/>
+        </w:rPr>
         <w:t xml:space="preserve"> %</w:t>
       </w:r>
       <w:r>
+        <w:rPr>
+          <w:rFonts w:ascii="Times New Roman" w:hAnsi="Times New Roman" w:cs="Times New Roman"/>
+          <w:sz w:val="24"/>
+          <w:szCs w:val="24"/>
+        </w:rPr>
         <w:t>15</w:t>
       </w:r>
       <w:r>
+        <w:rPr>
+          <w:rFonts w:ascii="Times New Roman" w:hAnsi="Times New Roman" w:cs="Times New Roman"/>
+          <w:sz w:val="24"/>
+          <w:szCs w:val="24"/>
+        </w:rPr>
         <w:t xml:space="preserve"> takip tahsil giderini</w:t>
       </w:r>
       <w:r>
+        <w:rPr>
+          <w:rFonts w:ascii="Times New Roman" w:hAnsi="Times New Roman" w:cs="Times New Roman"/>
+          <w:sz w:val="24"/>
+          <w:szCs w:val="24"/>
+        </w:rPr>
         <w:t xml:space="preserve"> ve </w:t>
       </w:r>
       <w:r>
+        <w:rPr>
+          <w:rFonts w:ascii="Times New Roman" w:hAnsi="Times New Roman" w:cs="Times New Roman"/>
+          <w:sz w:val="24"/>
+          <w:szCs w:val="24"/>
+        </w:rPr>
         <w:t>taksitinizin tahsilatı yolunda fiilen sarfedilen giderler</w:t>
       </w:r>
       <w:r>
+        <w:rPr>
+          <w:rFonts w:ascii="Times New Roman" w:hAnsi="Times New Roman" w:cs="Times New Roman"/>
+          <w:sz w:val="24"/>
+          <w:szCs w:val="24"/>
+        </w:rPr>
         <w:t>i</w:t>
       </w:r>
       <w:r>
+        <w:rPr>
+          <w:rFonts w:ascii="Times New Roman" w:hAnsi="Times New Roman" w:cs="Times New Roman"/>
+          <w:sz w:val="24"/>
+          <w:szCs w:val="24"/>
+        </w:rPr>
         <w:t>n tamamını</w:t>
       </w:r>
       <w:r>
+        <w:rPr>
+          <w:rFonts w:ascii="Times New Roman" w:hAnsi="Times New Roman" w:cs="Times New Roman"/>
+          <w:sz w:val="24"/>
+          <w:szCs w:val="24"/>
+        </w:rPr>
         <w:t xml:space="preserve"> </w:t>
       </w:r>
       <w:r>
-        <w:t>ödem</w:t>
-      </w:r>
-      <w:r>
-        <w:t>emeniz durumunda, Finansal Kiralama mevzuatı</w:t>
-      </w:r>
-      <w:r>
+        <w:rPr>
+          <w:rFonts w:ascii="Times New Roman" w:hAnsi="Times New Roman" w:cs="Times New Roman"/>
+          <w:sz w:val="24"/>
+          <w:szCs w:val="24"/>
+        </w:rPr>
+        <w:t>ödememeniz durumunda, Finansal Kiralama mevzuatı</w:t>
+      </w:r>
+      <w:r>
+        <w:rPr>
+          <w:rFonts w:ascii="Times New Roman" w:hAnsi="Times New Roman" w:cs="Times New Roman"/>
+          <w:sz w:val="24"/>
+          <w:szCs w:val="24"/>
+        </w:rPr>
         <w:t xml:space="preserve"> başta olmak üzere yasal düzenlemeler</w:t>
       </w:r>
       <w:r>
+        <w:rPr>
+          <w:rFonts w:ascii="Times New Roman" w:hAnsi="Times New Roman" w:cs="Times New Roman"/>
+          <w:sz w:val="24"/>
+          <w:szCs w:val="24"/>
+        </w:rPr>
         <w:t xml:space="preserve"> ve sözleşmenizin gereği olarak, </w:t>
       </w:r>
       <w:r>
+        <w:rPr>
+          <w:rFonts w:ascii="Times New Roman" w:hAnsi="Times New Roman" w:cs="Times New Roman"/>
+          <w:sz w:val="24"/>
+          <w:szCs w:val="24"/>
+        </w:rPr>
         <w:t xml:space="preserve">sözleşmeden dönmek veya </w:t>
       </w:r>
       <w:r>
+        <w:rPr>
+          <w:rFonts w:ascii="Times New Roman" w:hAnsi="Times New Roman" w:cs="Times New Roman"/>
+          <w:sz w:val="24"/>
+          <w:szCs w:val="24"/>
+        </w:rPr>
         <w:t>h</w:t>
       </w:r>
       <w:r>
+        <w:rPr>
+          <w:rFonts w:ascii="Times New Roman" w:hAnsi="Times New Roman" w:cs="Times New Roman"/>
+          <w:sz w:val="24"/>
+          <w:szCs w:val="24"/>
+        </w:rPr>
         <w:t>enüz vadesi gelmeyen bakiye borçlarınızı muaccel kılmak suretiyle borcun</w:t>
       </w:r>
       <w:r>
+        <w:rPr>
+          <w:rFonts w:ascii="Times New Roman" w:hAnsi="Times New Roman" w:cs="Times New Roman"/>
+          <w:sz w:val="24"/>
+          <w:szCs w:val="24"/>
+        </w:rPr>
         <w:t>uzun</w:t>
       </w:r>
       <w:r>
+        <w:rPr>
+          <w:rFonts w:ascii="Times New Roman" w:hAnsi="Times New Roman" w:cs="Times New Roman"/>
+          <w:sz w:val="24"/>
+          <w:szCs w:val="24"/>
+        </w:rPr>
         <w:t xml:space="preserve"> tahsili veya</w:t>
       </w:r>
       <w:r>
+        <w:rPr>
+          <w:rFonts w:ascii="Times New Roman" w:hAnsi="Times New Roman" w:cs="Times New Roman"/>
+          <w:sz w:val="24"/>
+          <w:szCs w:val="24"/>
+        </w:rPr>
         <w:t xml:space="preserve"> aynı surette</w:t>
       </w:r>
       <w:r>
+        <w:rPr>
+          <w:rFonts w:ascii="Times New Roman" w:hAnsi="Times New Roman" w:cs="Times New Roman"/>
+          <w:sz w:val="24"/>
+          <w:szCs w:val="24"/>
+        </w:rPr>
         <w:t xml:space="preserve"> sözleşmenin feshi </w:t>
       </w:r>
       <w:r>
+        <w:rPr>
+          <w:rFonts w:ascii="Times New Roman" w:hAnsi="Times New Roman" w:cs="Times New Roman"/>
+          <w:sz w:val="24"/>
+          <w:szCs w:val="24"/>
+        </w:rPr>
         <w:t>yoluna gitmek</w:t>
       </w:r>
       <w:r>
+        <w:rPr>
+          <w:rFonts w:ascii="Times New Roman" w:hAnsi="Times New Roman" w:cs="Times New Roman"/>
+          <w:sz w:val="24"/>
+          <w:szCs w:val="24"/>
+        </w:rPr>
         <w:t xml:space="preserve"> durumunda olacağımızı</w:t>
       </w:r>
       <w:r>
+        <w:rPr>
+          <w:rFonts w:ascii="Times New Roman" w:hAnsi="Times New Roman" w:cs="Times New Roman"/>
+          <w:sz w:val="24"/>
+          <w:szCs w:val="24"/>
+        </w:rPr>
         <w:t xml:space="preserve">  üzülerek ifade ederiz</w:t>
       </w:r>
       <w:r>
+        <w:rPr>
+          <w:rFonts w:ascii="Times New Roman" w:hAnsi="Times New Roman" w:cs="Times New Roman"/>
+          <w:sz w:val="24"/>
+          <w:szCs w:val="24"/>
+        </w:rPr>
         <w:t xml:space="preserve">. </w:t>
       </w:r>
     </w:p>
@@ -273,14 +612,34 @@
         <w:spacing w:before="120" w:after="120"/>
         <w:contextualSpacing/>
         <w:jc w:val="both"/>
-      </w:pPr>
-      <w:r>
+        <w:rPr>
+          <w:rFonts w:ascii="Times New Roman" w:hAnsi="Times New Roman" w:cs="Times New Roman"/>
+          <w:sz w:val="24"/>
+          <w:szCs w:val="24"/>
+        </w:rPr>
+      </w:pPr>
+      <w:r>
+        <w:rPr>
+          <w:rFonts w:ascii="Times New Roman" w:hAnsi="Times New Roman" w:cs="Times New Roman"/>
+          <w:sz w:val="24"/>
+          <w:szCs w:val="24"/>
+        </w:rPr>
         <w:t xml:space="preserve">Sizinle şirketimiz arasında kalıcı, sağlıklı, karşılıklı güvene dayalı güzel bir ilişki olmasını öngörüyoruz. Geciken borcunuzu </w:t>
       </w:r>
       <w:r>
+        <w:rPr>
+          <w:rFonts w:ascii="Times New Roman" w:hAnsi="Times New Roman" w:cs="Times New Roman"/>
+          <w:sz w:val="24"/>
+          <w:szCs w:val="24"/>
+        </w:rPr>
         <w:t xml:space="preserve">işbu yazımızda belirtilen şekilde yerine getirerek </w:t>
       </w:r>
       <w:r>
+        <w:rPr>
+          <w:rFonts w:ascii="Times New Roman" w:hAnsi="Times New Roman" w:cs="Times New Roman"/>
+          <w:sz w:val="24"/>
+          <w:szCs w:val="24"/>
+        </w:rPr>
         <w:t>ve bakiye taksitlerinizi zamanında ödeyerek bu öngörümüzü sürdürmede bize yardımcı olacağınızı umuyoruz.</w:t>
       </w:r>
     </w:p>
@@ -289,63 +648,109 @@
         <w:spacing w:before="120" w:after="120"/>
         <w:contextualSpacing/>
         <w:jc w:val="both"/>
-      </w:pPr>
-      <w:r>
+        <w:rPr>
+          <w:rFonts w:ascii="Times New Roman" w:hAnsi="Times New Roman" w:cs="Times New Roman"/>
+          <w:sz w:val="24"/>
+          <w:szCs w:val="24"/>
+        </w:rPr>
+      </w:pPr>
+      <w:r>
+        <w:rPr>
+          <w:rFonts w:ascii="Times New Roman" w:hAnsi="Times New Roman" w:cs="Times New Roman"/>
+          <w:sz w:val="24"/>
+          <w:szCs w:val="24"/>
+        </w:rPr>
         <w:t xml:space="preserve">En iyi dileklerimizi </w:t>
       </w:r>
       <w:r>
+        <w:rPr>
+          <w:rFonts w:ascii="Times New Roman" w:hAnsi="Times New Roman" w:cs="Times New Roman"/>
+          <w:sz w:val="24"/>
+          <w:szCs w:val="24"/>
+        </w:rPr>
         <w:t>sunarız.</w:t>
       </w:r>
     </w:p>
     <w:p>
       <w:pPr>
         <w:jc w:val="both"/>
+        <w:rPr>
+          <w:rFonts w:ascii="Times New Roman" w:hAnsi="Times New Roman" w:cs="Times New Roman"/>
+          <w:sz w:val="24"/>
+          <w:szCs w:val="24"/>
+        </w:rPr>
       </w:pPr>
     </w:p>
     <w:p>
       <w:pPr>
         <w:jc w:val="both"/>
+        <w:rPr>
+          <w:rFonts w:ascii="Times New Roman" w:hAnsi="Times New Roman" w:cs="Times New Roman"/>
+          <w:sz w:val="24"/>
+          <w:szCs w:val="24"/>
+        </w:rPr>
       </w:pPr>
     </w:p>
     <w:p>
       <w:pPr>
         <w:jc w:val="both"/>
         <w:rPr>
+          <w:rFonts w:ascii="Times New Roman" w:hAnsi="Times New Roman" w:cs="Times New Roman"/>
+          <w:sz w:val="24"/>
+          <w:szCs w:val="24"/>
           <w:u w:val="single"/>
         </w:rPr>
       </w:pPr>
       <w:r>
         <w:rPr>
+          <w:rFonts w:ascii="Times New Roman" w:hAnsi="Times New Roman" w:cs="Times New Roman"/>
+          <w:sz w:val="24"/>
+          <w:szCs w:val="24"/>
           <w:u w:val="single"/>
         </w:rPr>
         <w:t>S</w:t>
       </w:r>
       <w:r>
         <w:rPr>
+          <w:rFonts w:ascii="Times New Roman" w:hAnsi="Times New Roman" w:cs="Times New Roman"/>
+          <w:sz w:val="24"/>
+          <w:szCs w:val="24"/>
           <w:u w:val="single"/>
         </w:rPr>
         <w:t xml:space="preserve">özleşme </w:t>
       </w:r>
       <w:r>
         <w:rPr>
+          <w:rFonts w:ascii="Times New Roman" w:hAnsi="Times New Roman" w:cs="Times New Roman"/>
+          <w:sz w:val="24"/>
+          <w:szCs w:val="24"/>
           <w:u w:val="single"/>
         </w:rPr>
         <w:t>H</w:t>
       </w:r>
       <w:r>
         <w:rPr>
+          <w:rFonts w:ascii="Times New Roman" w:hAnsi="Times New Roman" w:cs="Times New Roman"/>
+          <w:sz w:val="24"/>
+          <w:szCs w:val="24"/>
           <w:u w:val="single"/>
         </w:rPr>
         <w:t xml:space="preserve">akkında </w:t>
       </w:r>
       <w:r>
         <w:rPr>
+          <w:rFonts w:ascii="Times New Roman" w:hAnsi="Times New Roman" w:cs="Times New Roman"/>
+          <w:sz w:val="24"/>
+          <w:szCs w:val="24"/>
           <w:u w:val="single"/>
         </w:rPr>
         <w:t>N</w:t>
       </w:r>
       <w:r>
         <w:rPr>
+          <w:rFonts w:ascii="Times New Roman" w:hAnsi="Times New Roman" w:cs="Times New Roman"/>
+          <w:sz w:val="24"/>
+          <w:szCs w:val="24"/>
           <w:u w:val="single"/>
         </w:rPr>
         <w:t xml:space="preserve">ot: </w:t>
@@ -359,9 +764,15 @@
           <w:numId w:val="1"/>
         </w:numPr>
         <w:jc w:val="both"/>
-      </w:pPr>
-      <w:r>
-        <w:rPr>
+        <w:rPr>
+          <w:rFonts w:ascii="Times New Roman" w:hAnsi="Times New Roman" w:cs="Times New Roman"/>
+          <w:sz w:val="24"/>
+          <w:szCs w:val="24"/>
+        </w:rPr>
+      </w:pPr>
+      <w:r>
+        <w:rPr>
+          <w:rFonts w:ascii="Times New Roman" w:hAnsi="Times New Roman" w:cs="Times New Roman"/>
           <w:sz w:val="24"/>
           <w:szCs w:val="24"/>
         </w:rPr>
@@ -370,6 +781,7 @@
       <w:proofErr w:type="spellStart"/>
       <w:r>
         <w:rPr>
+          <w:rFonts w:ascii="Times New Roman" w:hAnsi="Times New Roman" w:cs="Times New Roman"/>
           <w:sz w:val="24"/>
           <w:szCs w:val="24"/>
         </w:rPr>
@@ -378,16 +790,23 @@
       <w:proofErr w:type="spellEnd"/>
       <w:r>
         <w:rPr>
+          <w:rFonts w:ascii="Times New Roman" w:hAnsi="Times New Roman" w:cs="Times New Roman"/>
           <w:sz w:val="24"/>
           <w:szCs w:val="24"/>
         </w:rPr>
         <w:t xml:space="preserve">}} </w:t>
       </w:r>
       <w:r>
+        <w:rPr>
+          <w:rFonts w:ascii="Times New Roman" w:hAnsi="Times New Roman" w:cs="Times New Roman"/>
+          <w:sz w:val="24"/>
+          <w:szCs w:val="24"/>
+        </w:rPr>
         <w:t xml:space="preserve">tarih ve </w:t>
       </w:r>
       <w:r>
         <w:rPr>
+          <w:rFonts w:ascii="Times New Roman" w:hAnsi="Times New Roman" w:cs="Times New Roman"/>
           <w:sz w:val="24"/>
           <w:szCs w:val="24"/>
         </w:rPr>
@@ -395,11 +814,17 @@
       </w:r>
       <w:proofErr w:type="spellStart"/>
       <w:r>
+        <w:rPr>
+          <w:rFonts w:ascii="Times New Roman" w:hAnsi="Times New Roman" w:cs="Times New Roman"/>
+          <w:sz w:val="24"/>
+          <w:szCs w:val="24"/>
+        </w:rPr>
         <w:t>sozlesme_no</w:t>
       </w:r>
       <w:proofErr w:type="spellEnd"/>
       <w:r>
         <w:rPr>
+          <w:rFonts w:ascii="Times New Roman" w:hAnsi="Times New Roman" w:cs="Times New Roman"/>
           <w:sz w:val="24"/>
           <w:szCs w:val="24"/>
         </w:rPr>
@@ -407,10 +832,20 @@
       </w:r>
       <w:proofErr w:type="spellStart"/>
       <w:r>
+        <w:rPr>
+          <w:rFonts w:ascii="Times New Roman" w:hAnsi="Times New Roman" w:cs="Times New Roman"/>
+          <w:sz w:val="24"/>
+          <w:szCs w:val="24"/>
+        </w:rPr>
         <w:t>nolu</w:t>
       </w:r>
       <w:proofErr w:type="spellEnd"/>
       <w:r>
+        <w:rPr>
+          <w:rFonts w:ascii="Times New Roman" w:hAnsi="Times New Roman" w:cs="Times New Roman"/>
+          <w:sz w:val="24"/>
+          <w:szCs w:val="24"/>
+        </w:rPr>
         <w:t xml:space="preserve"> finansal kiralama sözleşmemiz</w:t>
       </w:r>
     </w:p>
@@ -422,15 +857,23 @@
           <w:numId w:val="1"/>
         </w:numPr>
         <w:jc w:val="both"/>
-      </w:pPr>
-      <w:r>
-        <w:t xml:space="preserve">Vadesinde ödenmeyen </w:t>
-      </w:r>
-      <w:r>
-        <w:t xml:space="preserve">taksitleriniz </w:t>
-      </w:r>
-      <w:r>
-        <w:rPr>
+        <w:rPr>
+          <w:rFonts w:ascii="Times New Roman" w:hAnsi="Times New Roman" w:cs="Times New Roman"/>
+          <w:sz w:val="24"/>
+          <w:szCs w:val="24"/>
+        </w:rPr>
+      </w:pPr>
+      <w:r>
+        <w:rPr>
+          <w:rFonts w:ascii="Times New Roman" w:hAnsi="Times New Roman" w:cs="Times New Roman"/>
+          <w:sz w:val="24"/>
+          <w:szCs w:val="24"/>
+        </w:rPr>
+        <w:t xml:space="preserve">Vadesinde ödenmeyen taksitleriniz </w:t>
+      </w:r>
+      <w:r>
+        <w:rPr>
+          <w:rFonts w:ascii="Times New Roman" w:hAnsi="Times New Roman" w:cs="Times New Roman"/>
           <w:bCs/>
           <w:sz w:val="24"/>
           <w:szCs w:val="24"/>
@@ -440,6 +883,7 @@
       <w:proofErr w:type="spellStart"/>
       <w:r>
         <w:rPr>
+          <w:rFonts w:ascii="Times New Roman" w:hAnsi="Times New Roman" w:cs="Times New Roman"/>
           <w:bCs/>
           <w:sz w:val="24"/>
           <w:szCs w:val="24"/>
@@ -449,6 +893,7 @@
       <w:proofErr w:type="spellEnd"/>
       <w:r>
         <w:rPr>
+          <w:rFonts w:ascii="Times New Roman" w:hAnsi="Times New Roman" w:cs="Times New Roman"/>
           <w:bCs/>
           <w:sz w:val="24"/>
           <w:szCs w:val="24"/>
@@ -456,6 +901,11 @@
         <w:t xml:space="preserve">}} </w:t>
       </w:r>
       <w:r>
+        <w:rPr>
+          <w:rFonts w:ascii="Times New Roman" w:hAnsi="Times New Roman" w:cs="Times New Roman"/>
+          <w:sz w:val="24"/>
+          <w:szCs w:val="24"/>
+        </w:rPr>
         <w:t>TL</w:t>
       </w:r>
     </w:p>
@@ -467,12 +917,23 @@
           <w:numId w:val="1"/>
         </w:numPr>
         <w:jc w:val="both"/>
-      </w:pPr>
-      <w:r>
+        <w:rPr>
+          <w:rFonts w:ascii="Times New Roman" w:hAnsi="Times New Roman" w:cs="Times New Roman"/>
+          <w:sz w:val="24"/>
+          <w:szCs w:val="24"/>
+        </w:rPr>
+      </w:pPr>
+      <w:r>
+        <w:rPr>
+          <w:rFonts w:ascii="Times New Roman" w:hAnsi="Times New Roman" w:cs="Times New Roman"/>
+          <w:sz w:val="24"/>
+          <w:szCs w:val="24"/>
+        </w:rPr>
         <w:t xml:space="preserve">%15 takip ve tahsil gideri </w:t>
       </w:r>
       <w:r>
         <w:rPr>
+          <w:rFonts w:ascii="Times New Roman" w:hAnsi="Times New Roman" w:cs="Times New Roman"/>
           <w:bCs/>
           <w:sz w:val="24"/>
           <w:szCs w:val="24"/>
@@ -482,13 +943,17 @@
       <w:proofErr w:type="spellStart"/>
       <w:r>
         <w:rPr>
+          <w:rFonts w:ascii="Times New Roman" w:hAnsi="Times New Roman" w:cs="Times New Roman"/>
           <w:bCs/>
+          <w:sz w:val="24"/>
+          <w:szCs w:val="24"/>
         </w:rPr>
         <w:t>masraf_bakiye</w:t>
       </w:r>
       <w:proofErr w:type="spellEnd"/>
       <w:r>
         <w:rPr>
+          <w:rFonts w:ascii="Times New Roman" w:hAnsi="Times New Roman" w:cs="Times New Roman"/>
           <w:bCs/>
           <w:sz w:val="24"/>
           <w:szCs w:val="24"/>
@@ -496,6 +961,11 @@
         <w:t xml:space="preserve">}} </w:t>
       </w:r>
       <w:r>
+        <w:rPr>
+          <w:rFonts w:ascii="Times New Roman" w:hAnsi="Times New Roman" w:cs="Times New Roman"/>
+          <w:sz w:val="24"/>
+          <w:szCs w:val="24"/>
+        </w:rPr>
         <w:t>TL</w:t>
       </w:r>
     </w:p>
@@ -507,12 +977,23 @@
           <w:numId w:val="1"/>
         </w:numPr>
         <w:jc w:val="both"/>
-      </w:pPr>
-      <w:r>
+        <w:rPr>
+          <w:rFonts w:ascii="Times New Roman" w:hAnsi="Times New Roman" w:cs="Times New Roman"/>
+          <w:sz w:val="24"/>
+          <w:szCs w:val="24"/>
+        </w:rPr>
+      </w:pPr>
+      <w:r>
+        <w:rPr>
+          <w:rFonts w:ascii="Times New Roman" w:hAnsi="Times New Roman" w:cs="Times New Roman"/>
+          <w:sz w:val="24"/>
+          <w:szCs w:val="24"/>
+        </w:rPr>
         <w:t xml:space="preserve">Toplam </w:t>
       </w:r>
       <w:r>
         <w:rPr>
+          <w:rFonts w:ascii="Times New Roman" w:hAnsi="Times New Roman" w:cs="Times New Roman"/>
           <w:bCs/>
           <w:sz w:val="24"/>
           <w:szCs w:val="24"/>
@@ -522,6 +1003,7 @@
       <w:proofErr w:type="spellStart"/>
       <w:r>
         <w:rPr>
+          <w:rFonts w:ascii="Times New Roman" w:hAnsi="Times New Roman" w:cs="Times New Roman"/>
           <w:bCs/>
           <w:sz w:val="24"/>
           <w:szCs w:val="24"/>
@@ -531,21 +1013,19 @@
       <w:proofErr w:type="spellEnd"/>
       <w:r>
         <w:rPr>
+          <w:rFonts w:ascii="Times New Roman" w:hAnsi="Times New Roman" w:cs="Times New Roman"/>
           <w:bCs/>
           <w:sz w:val="24"/>
           <w:szCs w:val="24"/>
         </w:rPr>
-        <w:t>}}</w:t>
-      </w:r>
-      <w:r>
-        <w:rPr>
-          <w:bCs/>
-          <w:sz w:val="24"/>
-          <w:szCs w:val="24"/>
-        </w:rPr>
-        <w:t xml:space="preserve"> </w:t>
-      </w:r>
-      <w:r>
+        <w:t xml:space="preserve">}} </w:t>
+      </w:r>
+      <w:r>
+        <w:rPr>
+          <w:rFonts w:ascii="Times New Roman" w:hAnsi="Times New Roman" w:cs="Times New Roman"/>
+          <w:sz w:val="24"/>
+          <w:szCs w:val="24"/>
+        </w:rPr>
         <w:t>TL</w:t>
       </w:r>
     </w:p>
@@ -557,34 +1037,100 @@
           <w:numId w:val="1"/>
         </w:numPr>
         <w:jc w:val="both"/>
-      </w:pPr>
-      <w:r>
+        <w:rPr>
+          <w:rFonts w:ascii="Times New Roman" w:hAnsi="Times New Roman" w:cs="Times New Roman"/>
+          <w:sz w:val="24"/>
+          <w:szCs w:val="24"/>
+        </w:rPr>
+      </w:pPr>
+      <w:r>
+        <w:rPr>
+          <w:rFonts w:ascii="Times New Roman" w:hAnsi="Times New Roman" w:cs="Times New Roman"/>
+          <w:sz w:val="24"/>
+          <w:szCs w:val="24"/>
+        </w:rPr>
         <w:t xml:space="preserve">Tebliğ giderleri (Noter </w:t>
       </w:r>
       <w:proofErr w:type="gramStart"/>
       <w:r>
+        <w:rPr>
+          <w:rFonts w:ascii="Times New Roman" w:hAnsi="Times New Roman" w:cs="Times New Roman"/>
+          <w:sz w:val="24"/>
+          <w:szCs w:val="24"/>
+        </w:rPr>
         <w:t>gönderimlerinde)  3200.00</w:t>
       </w:r>
       <w:proofErr w:type="gramEnd"/>
       <w:r>
-        <w:t xml:space="preserve"> </w:t>
-      </w:r>
-      <w:r>
-        <w:t>TL</w:t>
+        <w:rPr>
+          <w:rFonts w:ascii="Times New Roman" w:hAnsi="Times New Roman" w:cs="Times New Roman"/>
+          <w:sz w:val="24"/>
+          <w:szCs w:val="24"/>
+        </w:rPr>
+        <w:t xml:space="preserve"> TL</w:t>
       </w:r>
     </w:p>
     <w:p>
       <w:pPr>
         <w:pStyle w:val="ListeParagraf"/>
         <w:jc w:val="both"/>
+        <w:rPr>
+          <w:rFonts w:ascii="Times New Roman" w:hAnsi="Times New Roman" w:cs="Times New Roman"/>
+          <w:sz w:val="24"/>
+          <w:szCs w:val="24"/>
+        </w:rPr>
       </w:pPr>
     </w:p>
     <w:p>
       <w:pPr>
+        <w:pStyle w:val="ListeParagraf"/>
         <w:jc w:val="both"/>
-      </w:pPr>
+        <w:rPr>
+          <w:rFonts w:ascii="Times New Roman" w:hAnsi="Times New Roman" w:cs="Times New Roman"/>
+          <w:sz w:val="24"/>
+          <w:szCs w:val="24"/>
+        </w:rPr>
+      </w:pPr>
+    </w:p>
+    <w:p>
+      <w:pPr>
+        <w:jc w:val="both"/>
+        <w:rPr>
+          <w:rFonts w:ascii="Times New Roman" w:hAnsi="Times New Roman" w:cs="Times New Roman"/>
+          <w:sz w:val="24"/>
+          <w:szCs w:val="24"/>
+        </w:rPr>
+      </w:pPr>
+      <w:r>
+        <w:rPr>
+          <w:rFonts w:ascii="Times New Roman" w:hAnsi="Times New Roman" w:cs="Times New Roman"/>
+          <w:sz w:val="24"/>
+          <w:szCs w:val="24"/>
+        </w:rPr>
+        <w:t xml:space="preserve">Sayın Noter, </w:t>
+      </w:r>
+    </w:p>
+    <w:p>
+      <w:pPr>
+        <w:jc w:val="both"/>
+        <w:rPr>
+          <w:rFonts w:ascii="Times New Roman" w:hAnsi="Times New Roman" w:cs="Times New Roman"/>
+          <w:sz w:val="24"/>
+          <w:szCs w:val="24"/>
+        </w:rPr>
+      </w:pPr>
+      <w:r>
+        <w:rPr>
+          <w:rFonts w:ascii="Times New Roman" w:hAnsi="Times New Roman" w:cs="Times New Roman"/>
+          <w:sz w:val="24"/>
+          <w:szCs w:val="24"/>
+        </w:rPr>
+        <w:t>3 nüshadan ibaret işbu ihtarnamenin bir suretini karşı tarafa e-tebligat yoksa hızlı posta ile tebliğini, tebliğ şerhi taşıyan bir suretinin tarafıma verilmesini, diğer suretinin dairenizde saklanmasını saygılarımla talep ederim.</w:t>
+      </w:r>
     </w:p>
     <w:sectPr>
+      <w:headerReference w:type="default" r:id="rId7"/>
+      <w:footerReference w:type="default" r:id="rId8"/>
       <w:pgSz w:w="11906" w:h="16838"/>
       <w:pgMar w:top="1417" w:right="1417" w:bottom="1417" w:left="1417" w:header="708" w:footer="708" w:gutter="0"/>
       <w:cols w:space="708"/>
@@ -592,6 +1138,284 @@
     </w:sectPr>
   </w:body>
 </w:document>
+</file>
+
+<file path=word/endnotes.xml><?xml version="1.0" encoding="utf-8"?>
+<w:endnotes xmlns:wpc="http://schemas.microsoft.com/office/word/2010/wordprocessingCanvas" xmlns:cx="http://schemas.microsoft.com/office/drawing/2014/chartex" xmlns:cx1="http://schemas.microsoft.com/office/drawing/2015/9/8/chartex" xmlns:cx2="http://schemas.microsoft.com/office/drawing/2015/10/21/chartex" xmlns:cx3="http://schemas.microsoft.com/office/drawing/2016/5/9/chartex" xmlns:cx4="http://schemas.microsoft.com/office/drawing/2016/5/10/chartex" xmlns:cx5="http://schemas.microsoft.com/office/drawing/2016/5/11/chartex" xmlns:cx6="http://schemas.microsoft.com/office/drawing/2016/5/12/chartex" xmlns:cx7="http://schemas.microsoft.com/office/drawing/2016/5/13/chartex" xmlns:cx8="http://schemas.microsoft.com/office/drawing/2016/5/14/chartex" xmlns:mc="http://schemas.openxmlformats.org/markup-compatibility/2006" xmlns:aink="http://schemas.microsoft.com/office/drawing/2016/ink" xmlns:am3d="http://schemas.microsoft.com/office/drawing/2017/model3d" xmlns:o="urn:schemas-microsoft-com:office:office" xmlns:oel="http://schemas.microsoft.com/office/2019/extlst" xmlns:r="http://schemas.openxmlformats.org/officeDocument/2006/relationships" xmlns:m="http://schemas.openxmlformats.org/officeDocument/2006/math" xmlns:v="urn:schemas-microsoft-com:vml" xmlns:wp14="http://schemas.microsoft.com/office/word/2010/wordprocessingDrawing" xmlns:wp="http://schemas.openxmlformats.org/drawingml/2006/wordprocessingDrawing" xmlns:w10="urn:schemas-microsoft-com:office:word" xmlns:w="http://schemas.openxmlformats.org/wordprocessingml/2006/main" xmlns:w14="http://schemas.microsoft.com/office/word/2010/wordml" xmlns:w15="http://schemas.microsoft.com/office/word/2012/wordml" xmlns:w16cex="http://schemas.microsoft.com/office/word/2018/wordml/cex" xmlns:w16cid="http://schemas.microsoft.com/office/word/2016/wordml/cid" xmlns:w16="http://schemas.microsoft.com/office/word/2018/wordml" xmlns:w16du="http://schemas.microsoft.com/office/word/2023/wordml/word16du" xmlns:w16sdtdh="http://schemas.microsoft.com/office/word/2020/wordml/sdtdatahash" xmlns:w16sdtfl="http://schemas.microsoft.com/office/word/2024/wordml/sdtformatlock" xmlns:w16se="http://schemas.microsoft.com/office/word/2015/wordml/symex" xmlns:wpg="http://schemas.microsoft.com/office/word/2010/wordprocessingGroup" xmlns:wpi="http://schemas.microsoft.com/office/word/2010/wordprocessingInk" xmlns:wne="http://schemas.microsoft.com/office/word/2006/wordml" xmlns:wps="http://schemas.microsoft.com/office/word/2010/wordprocessingShape" mc:Ignorable="w14 w15 w16se w16cid w16 w16cex w16sdtdh w16sdtfl w16du wp14">
+  <w:endnote w:type="separator" w:id="-1">
+    <w:p>
+      <w:pPr>
+        <w:spacing w:after="0" w:line="240" w:lineRule="auto"/>
+      </w:pPr>
+      <w:r>
+        <w:separator/>
+      </w:r>
+    </w:p>
+  </w:endnote>
+  <w:endnote w:type="continuationSeparator" w:id="0">
+    <w:p>
+      <w:pPr>
+        <w:spacing w:after="0" w:line="240" w:lineRule="auto"/>
+      </w:pPr>
+      <w:r>
+        <w:continuationSeparator/>
+      </w:r>
+    </w:p>
+  </w:endnote>
+</w:endnotes>
+</file>
+
+<file path=word/footer1.xml><?xml version="1.0" encoding="utf-8"?>
+<w:ftr xmlns:wpc="http://schemas.microsoft.com/office/word/2010/wordprocessingCanvas" xmlns:cx="http://schemas.microsoft.com/office/drawing/2014/chartex" xmlns:cx1="http://schemas.microsoft.com/office/drawing/2015/9/8/chartex" xmlns:cx2="http://schemas.microsoft.com/office/drawing/2015/10/21/chartex" xmlns:cx3="http://schemas.microsoft.com/office/drawing/2016/5/9/chartex" xmlns:cx4="http://schemas.microsoft.com/office/drawing/2016/5/10/chartex" xmlns:cx5="http://schemas.microsoft.com/office/drawing/2016/5/11/chartex" xmlns:cx6="http://schemas.microsoft.com/office/drawing/2016/5/12/chartex" xmlns:cx7="http://schemas.microsoft.com/office/drawing/2016/5/13/chartex" xmlns:cx8="http://schemas.microsoft.com/office/drawing/2016/5/14/chartex" xmlns:mc="http://schemas.openxmlformats.org/markup-compatibility/2006" xmlns:aink="http://schemas.microsoft.com/office/drawing/2016/ink" xmlns:am3d="http://schemas.microsoft.com/office/drawing/2017/model3d" xmlns:o="urn:schemas-microsoft-com:office:office" xmlns:oel="http://schemas.microsoft.com/office/2019/extlst" xmlns:r="http://schemas.openxmlformats.org/officeDocument/2006/relationships" xmlns:m="http://schemas.openxmlformats.org/officeDocument/2006/math" xmlns:v="urn:schemas-microsoft-com:vml" xmlns:wp14="http://schemas.microsoft.com/office/word/2010/wordprocessingDrawing" xmlns:wp="http://schemas.openxmlformats.org/drawingml/2006/wordprocessingDrawing" xmlns:w10="urn:schemas-microsoft-com:office:word" xmlns:w="http://schemas.openxmlformats.org/wordprocessingml/2006/main" xmlns:w14="http://schemas.microsoft.com/office/word/2010/wordml" xmlns:w15="http://schemas.microsoft.com/office/word/2012/wordml" xmlns:w16cex="http://schemas.microsoft.com/office/word/2018/wordml/cex" xmlns:w16cid="http://schemas.microsoft.com/office/word/2016/wordml/cid" xmlns:w16="http://schemas.microsoft.com/office/word/2018/wordml" xmlns:w16du="http://schemas.microsoft.com/office/word/2023/wordml/word16du" xmlns:w16sdtdh="http://schemas.microsoft.com/office/word/2020/wordml/sdtdatahash" xmlns:w16sdtfl="http://schemas.microsoft.com/office/word/2024/wordml/sdtformatlock" xmlns:w16se="http://schemas.microsoft.com/office/word/2015/wordml/symex" xmlns:wpg="http://schemas.microsoft.com/office/word/2010/wordprocessingGroup" xmlns:wpi="http://schemas.microsoft.com/office/word/2010/wordprocessingInk" xmlns:wne="http://schemas.microsoft.com/office/word/2006/wordml" xmlns:wps="http://schemas.microsoft.com/office/word/2010/wordprocessingShape" mc:Ignorable="w14 w15 w16se w16cid w16 w16cex w16sdtdh w16sdtfl w16du wp14">
+  <w:p>
+    <w:pPr>
+      <w:pStyle w:val="AltBilgi"/>
+      <w:rPr>
+        <w:rFonts w:ascii="Calibri" w:hAnsi="Calibri" w:cs="Calibri"/>
+        <w:color w:val="980748"/>
+        <w:sz w:val="24"/>
+        <w:szCs w:val="24"/>
+        <w:u w:val="single"/>
+      </w:rPr>
+    </w:pPr>
+    <w:r>
+      <w:rPr>
+        <w:rFonts w:ascii="Times New Roman" w:hAnsi="Times New Roman" w:cs="Times New Roman"/>
+        <w:color w:val="980748"/>
+        <w:sz w:val="24"/>
+        <w:szCs w:val="24"/>
+      </w:rPr>
+      <w:ptab w:relativeTo="margin" w:alignment="center" w:leader="none"/>
+    </w:r>
+    <w:bookmarkStart w:id="0" w:name="_Hlk216446062"/>
+    <w:r>
+      <w:rPr>
+        <w:rFonts w:ascii="Calibri" w:hAnsi="Calibri" w:cs="Calibri"/>
+        <w:color w:val="980748"/>
+        <w:sz w:val="24"/>
+        <w:szCs w:val="24"/>
+        <w:u w:val="single"/>
+      </w:rPr>
+      <w:t>ARI FİNANSAL KİRALAMA A.Ş</w:t>
+    </w:r>
+  </w:p>
+  <w:p>
+    <w:pPr>
+      <w:pStyle w:val="AltBilgi"/>
+      <w:rPr>
+        <w:rFonts w:ascii="Times New Roman" w:hAnsi="Times New Roman" w:cs="Times New Roman"/>
+        <w:sz w:val="24"/>
+        <w:szCs w:val="24"/>
+      </w:rPr>
+    </w:pPr>
+    <w:r>
+      <w:rPr>
+        <w:rFonts w:ascii="Calibri" w:hAnsi="Calibri" w:cs="Calibri"/>
+        <w:sz w:val="24"/>
+        <w:szCs w:val="24"/>
+      </w:rPr>
+      <w:tab/>
+      <w:t xml:space="preserve">İletişim: </w:t>
+    </w:r>
+    <w:proofErr w:type="gramStart"/>
+    <w:r>
+      <w:rPr>
+        <w:rFonts w:ascii="Calibri" w:hAnsi="Calibri" w:cs="Calibri"/>
+        <w:sz w:val="24"/>
+        <w:szCs w:val="24"/>
+      </w:rPr>
+      <w:t>444  76</w:t>
+    </w:r>
+    <w:proofErr w:type="gramEnd"/>
+    <w:r>
+      <w:rPr>
+        <w:rFonts w:ascii="Calibri" w:hAnsi="Calibri" w:cs="Calibri"/>
+        <w:sz w:val="24"/>
+        <w:szCs w:val="24"/>
+      </w:rPr>
+      <w:t xml:space="preserve"> 80</w:t>
+    </w:r>
+    <w:bookmarkEnd w:id="0"/>
+    <w:r>
+      <w:rPr>
+        <w:rFonts w:ascii="Calibri" w:hAnsi="Calibri" w:cs="Calibri"/>
+        <w:sz w:val="24"/>
+        <w:szCs w:val="24"/>
+      </w:rPr>
+      <w:t xml:space="preserve"> </w:t>
+    </w:r>
+    <w:r>
+      <w:rPr>
+        <w:rFonts w:ascii="Times New Roman" w:hAnsi="Times New Roman" w:cs="Times New Roman"/>
+        <w:sz w:val="24"/>
+        <w:szCs w:val="24"/>
+      </w:rPr>
+      <w:ptab w:relativeTo="margin" w:alignment="right" w:leader="none"/>
+    </w:r>
+  </w:p>
+</w:ftr>
+</file>
+
+<file path=word/footnotes.xml><?xml version="1.0" encoding="utf-8"?>
+<w:footnotes xmlns:wpc="http://schemas.microsoft.com/office/word/2010/wordprocessingCanvas" xmlns:cx="http://schemas.microsoft.com/office/drawing/2014/chartex" xmlns:cx1="http://schemas.microsoft.com/office/drawing/2015/9/8/chartex" xmlns:cx2="http://schemas.microsoft.com/office/drawing/2015/10/21/chartex" xmlns:cx3="http://schemas.microsoft.com/office/drawing/2016/5/9/chartex" xmlns:cx4="http://schemas.microsoft.com/office/drawing/2016/5/10/chartex" xmlns:cx5="http://schemas.microsoft.com/office/drawing/2016/5/11/chartex" xmlns:cx6="http://schemas.microsoft.com/office/drawing/2016/5/12/chartex" xmlns:cx7="http://schemas.microsoft.com/office/drawing/2016/5/13/chartex" xmlns:cx8="http://schemas.microsoft.com/office/drawing/2016/5/14/chartex" xmlns:mc="http://schemas.openxmlformats.org/markup-compatibility/2006" xmlns:aink="http://schemas.microsoft.com/office/drawing/2016/ink" xmlns:am3d="http://schemas.microsoft.com/office/drawing/2017/model3d" xmlns:o="urn:schemas-microsoft-com:office:office" xmlns:oel="http://schemas.microsoft.com/office/2019/extlst" xmlns:r="http://schemas.openxmlformats.org/officeDocument/2006/relationships" xmlns:m="http://schemas.openxmlformats.org/officeDocument/2006/math" xmlns:v="urn:schemas-microsoft-com:vml" xmlns:wp14="http://schemas.microsoft.com/office/word/2010/wordprocessingDrawing" xmlns:wp="http://schemas.openxmlformats.org/drawingml/2006/wordprocessingDrawing" xmlns:w10="urn:schemas-microsoft-com:office:word" xmlns:w="http://schemas.openxmlformats.org/wordprocessingml/2006/main" xmlns:w14="http://schemas.microsoft.com/office/word/2010/wordml" xmlns:w15="http://schemas.microsoft.com/office/word/2012/wordml" xmlns:w16cex="http://schemas.microsoft.com/office/word/2018/wordml/cex" xmlns:w16cid="http://schemas.microsoft.com/office/word/2016/wordml/cid" xmlns:w16="http://schemas.microsoft.com/office/word/2018/wordml" xmlns:w16du="http://schemas.microsoft.com/office/word/2023/wordml/word16du" xmlns:w16sdtdh="http://schemas.microsoft.com/office/word/2020/wordml/sdtdatahash" xmlns:w16sdtfl="http://schemas.microsoft.com/office/word/2024/wordml/sdtformatlock" xmlns:w16se="http://schemas.microsoft.com/office/word/2015/wordml/symex" xmlns:wpg="http://schemas.microsoft.com/office/word/2010/wordprocessingGroup" xmlns:wpi="http://schemas.microsoft.com/office/word/2010/wordprocessingInk" xmlns:wne="http://schemas.microsoft.com/office/word/2006/wordml" xmlns:wps="http://schemas.microsoft.com/office/word/2010/wordprocessingShape" mc:Ignorable="w14 w15 w16se w16cid w16 w16cex w16sdtdh w16sdtfl w16du wp14">
+  <w:footnote w:type="separator" w:id="-1">
+    <w:p>
+      <w:pPr>
+        <w:spacing w:after="0" w:line="240" w:lineRule="auto"/>
+      </w:pPr>
+      <w:r>
+        <w:separator/>
+      </w:r>
+    </w:p>
+  </w:footnote>
+  <w:footnote w:type="continuationSeparator" w:id="0">
+    <w:p>
+      <w:pPr>
+        <w:spacing w:after="0" w:line="240" w:lineRule="auto"/>
+      </w:pPr>
+      <w:r>
+        <w:continuationSeparator/>
+      </w:r>
+    </w:p>
+  </w:footnote>
+</w:footnotes>
+</file>
+
+<file path=word/header1.xml><?xml version="1.0" encoding="utf-8"?>
+<w:hdr xmlns:wpc="http://schemas.microsoft.com/office/word/2010/wordprocessingCanvas" xmlns:cx="http://schemas.microsoft.com/office/drawing/2014/chartex" xmlns:cx1="http://schemas.microsoft.com/office/drawing/2015/9/8/chartex" xmlns:cx2="http://schemas.microsoft.com/office/drawing/2015/10/21/chartex" xmlns:cx3="http://schemas.microsoft.com/office/drawing/2016/5/9/chartex" xmlns:cx4="http://schemas.microsoft.com/office/drawing/2016/5/10/chartex" xmlns:cx5="http://schemas.microsoft.com/office/drawing/2016/5/11/chartex" xmlns:cx6="http://schemas.microsoft.com/office/drawing/2016/5/12/chartex" xmlns:cx7="http://schemas.microsoft.com/office/drawing/2016/5/13/chartex" xmlns:cx8="http://schemas.microsoft.com/office/drawing/2016/5/14/chartex" xmlns:mc="http://schemas.openxmlformats.org/markup-compatibility/2006" xmlns:aink="http://schemas.microsoft.com/office/drawing/2016/ink" xmlns:am3d="http://schemas.microsoft.com/office/drawing/2017/model3d" xmlns:o="urn:schemas-microsoft-com:office:office" xmlns:oel="http://schemas.microsoft.com/office/2019/extlst" xmlns:r="http://schemas.openxmlformats.org/officeDocument/2006/relationships" xmlns:m="http://schemas.openxmlformats.org/officeDocument/2006/math" xmlns:v="urn:schemas-microsoft-com:vml" xmlns:wp14="http://schemas.microsoft.com/office/word/2010/wordprocessingDrawing" xmlns:wp="http://schemas.openxmlformats.org/drawingml/2006/wordprocessingDrawing" xmlns:w10="urn:schemas-microsoft-com:office:word" xmlns:w="http://schemas.openxmlformats.org/wordprocessingml/2006/main" xmlns:w14="http://schemas.microsoft.com/office/word/2010/wordml" xmlns:w15="http://schemas.microsoft.com/office/word/2012/wordml" xmlns:w16cex="http://schemas.microsoft.com/office/word/2018/wordml/cex" xmlns:w16cid="http://schemas.microsoft.com/office/word/2016/wordml/cid" xmlns:w16="http://schemas.microsoft.com/office/word/2018/wordml" xmlns:w16du="http://schemas.microsoft.com/office/word/2023/wordml/word16du" xmlns:w16sdtdh="http://schemas.microsoft.com/office/word/2020/wordml/sdtdatahash" xmlns:w16sdtfl="http://schemas.microsoft.com/office/word/2024/wordml/sdtformatlock" xmlns:w16se="http://schemas.microsoft.com/office/word/2015/wordml/symex" xmlns:wpg="http://schemas.microsoft.com/office/word/2010/wordprocessingGroup" xmlns:wpi="http://schemas.microsoft.com/office/word/2010/wordprocessingInk" xmlns:wne="http://schemas.microsoft.com/office/word/2006/wordml" xmlns:wps="http://schemas.microsoft.com/office/word/2010/wordprocessingShape" mc:Ignorable="w14 w15 w16se w16cid w16 w16cex w16sdtdh w16sdtfl w16du wp14">
+  <w:p>
+    <w:pPr>
+      <w:pStyle w:val="stBilgi"/>
+      <w:rPr>
+        <w:rFonts w:ascii="Times New Roman" w:hAnsi="Times New Roman" w:cs="Times New Roman"/>
+        <w:sz w:val="24"/>
+        <w:szCs w:val="24"/>
+      </w:rPr>
+    </w:pPr>
+    <w:r>
+      <w:rPr>
+        <w:rFonts w:ascii="Times New Roman" w:hAnsi="Times New Roman" w:cs="Times New Roman"/>
+        <w:sz w:val="24"/>
+        <w:szCs w:val="24"/>
+      </w:rPr>
+      <w:ptab w:relativeTo="margin" w:alignment="center" w:leader="none"/>
+    </w:r>
+    <w:r>
+      <w:rPr>
+        <w:rFonts w:ascii="Times New Roman" w:hAnsi="Times New Roman" w:cs="Times New Roman"/>
+        <w:noProof/>
+        <w:sz w:val="24"/>
+        <w:szCs w:val="24"/>
+      </w:rPr>
+      <w:drawing>
+        <wp:inline distT="0" distB="0" distL="0" distR="0" wp14:anchorId="7C8B2679" wp14:editId="3F0A82F0">
+          <wp:extent cx="2135701" cy="593725"/>
+          <wp:effectExtent l="0" t="0" r="0" b="0"/>
+          <wp:docPr id="269751503" name="Resim 1" descr="metin, yazı tipi, ekran görüntüsü, grafik içeren bir resim&#10;&#10;Yapay zeka tarafından oluşturulmuş içerik yanlış olabilir."/>
+          <wp:cNvGraphicFramePr>
+            <a:graphicFrameLocks xmlns:a="http://schemas.openxmlformats.org/drawingml/2006/main" noChangeAspect="1"/>
+          </wp:cNvGraphicFramePr>
+          <a:graphic xmlns:a="http://schemas.openxmlformats.org/drawingml/2006/main">
+            <a:graphicData uri="http://schemas.openxmlformats.org/drawingml/2006/picture">
+              <pic:pic xmlns:pic="http://schemas.openxmlformats.org/drawingml/2006/picture">
+                <pic:nvPicPr>
+                  <pic:cNvPr id="269751503" name="Resim 1" descr="metin, yazı tipi, ekran görüntüsü, grafik içeren bir resim&#10;&#10;Yapay zeka tarafından oluşturulmuş içerik yanlış olabilir."/>
+                  <pic:cNvPicPr/>
+                </pic:nvPicPr>
+                <pic:blipFill>
+                  <a:blip r:embed="rId1">
+                    <a:extLst>
+                      <a:ext uri="{28A0092B-C50C-407E-A947-70E740481C1C}">
+                        <a14:useLocalDpi xmlns:a14="http://schemas.microsoft.com/office/drawing/2010/main" val="0"/>
+                      </a:ext>
+                    </a:extLst>
+                  </a:blip>
+                  <a:stretch>
+                    <a:fillRect/>
+                  </a:stretch>
+                </pic:blipFill>
+                <pic:spPr>
+                  <a:xfrm>
+                    <a:off x="0" y="0"/>
+                    <a:ext cx="2153858" cy="598773"/>
+                  </a:xfrm>
+                  <a:prstGeom prst="rect">
+                    <a:avLst/>
+                  </a:prstGeom>
+                </pic:spPr>
+              </pic:pic>
+            </a:graphicData>
+          </a:graphic>
+        </wp:inline>
+      </w:drawing>
+    </w:r>
+  </w:p>
+  <w:p>
+    <w:pPr>
+      <w:pStyle w:val="stBilgi"/>
+      <w:rPr>
+        <w:rFonts w:ascii="Times New Roman" w:hAnsi="Times New Roman" w:cs="Times New Roman"/>
+        <w:sz w:val="24"/>
+        <w:szCs w:val="24"/>
+      </w:rPr>
+    </w:pPr>
+  </w:p>
+  <w:p>
+    <w:pPr>
+      <w:pStyle w:val="stBilgi"/>
+      <w:rPr>
+        <w:rFonts w:ascii="Times New Roman" w:hAnsi="Times New Roman" w:cs="Times New Roman"/>
+        <w:sz w:val="24"/>
+        <w:szCs w:val="24"/>
+      </w:rPr>
+    </w:pPr>
+    <w:r>
+      <w:rPr>
+        <w:rFonts w:ascii="Times New Roman" w:hAnsi="Times New Roman" w:cs="Times New Roman"/>
+        <w:sz w:val="24"/>
+        <w:szCs w:val="24"/>
+      </w:rPr>
+      <w:tab/>
+    </w:r>
+    <w:r>
+      <w:rPr>
+        <w:rFonts w:ascii="Times New Roman" w:hAnsi="Times New Roman" w:cs="Times New Roman"/>
+        <w:b/>
+        <w:bCs/>
+        <w:sz w:val="24"/>
+        <w:szCs w:val="24"/>
+      </w:rPr>
+      <w:t xml:space="preserve">T.C. </w:t>
+    </w:r>
+    <w:r>
+      <w:rPr>
+        <w:rFonts w:ascii="Times New Roman" w:hAnsi="Times New Roman" w:cs="Times New Roman"/>
+        <w:b/>
+        <w:bCs/>
+        <w:noProof/>
+        <w:sz w:val="24"/>
+        <w:szCs w:val="24"/>
+      </w:rPr>
+      <w:t xml:space="preserve">BEŞİKTAŞ 5. NOTERLİĞİ </w:t>
+    </w:r>
+    <w:r>
+      <w:rPr>
+        <w:rFonts w:ascii="Times New Roman" w:hAnsi="Times New Roman" w:cs="Times New Roman"/>
+        <w:sz w:val="24"/>
+        <w:szCs w:val="24"/>
+      </w:rPr>
+      <w:ptab w:relativeTo="margin" w:alignment="right" w:leader="none"/>
+    </w:r>
+    <w:r>
+      <w:rPr>
+        <w:rFonts w:ascii="Times New Roman" w:hAnsi="Times New Roman" w:cs="Times New Roman"/>
+        <w:sz w:val="24"/>
+        <w:szCs w:val="24"/>
+      </w:rPr>
+      <w:t>{{tarih}}</w:t>
+    </w:r>
+  </w:p>
+</w:hdr>
 </file>
 
 <file path=word/numbering.xml><?xml version="1.0" encoding="utf-8"?>
@@ -1319,7 +2143,6 @@
   <w:style w:type="character" w:default="1" w:styleId="VarsaylanParagrafYazTipi">
     <w:name w:val="Default Paragraph Font"/>
     <w:uiPriority w:val="1"/>
-    <w:semiHidden/>
     <w:unhideWhenUsed/>
   </w:style>
   <w:style w:type="table" w:default="1" w:styleId="NormalTablo">
@@ -1724,6 +2547,50 @@
       <w:lang w:eastAsia="tr-TR"/>
       <w14:ligatures w14:val="none"/>
     </w:rPr>
+  </w:style>
+  <w:style w:type="paragraph" w:styleId="stBilgi">
+    <w:name w:val="header"/>
+    <w:basedOn w:val="Normal"/>
+    <w:link w:val="stBilgiChar"/>
+    <w:uiPriority w:val="99"/>
+    <w:unhideWhenUsed/>
+    <w:rsid w:val="0047501F"/>
+    <w:pPr>
+      <w:tabs>
+        <w:tab w:val="center" w:pos="4536"/>
+        <w:tab w:val="right" w:pos="9072"/>
+      </w:tabs>
+      <w:spacing w:after="0" w:line="240" w:lineRule="auto"/>
+    </w:pPr>
+  </w:style>
+  <w:style w:type="character" w:customStyle="1" w:styleId="stBilgiChar">
+    <w:name w:val="Üst Bilgi Char"/>
+    <w:basedOn w:val="VarsaylanParagrafYazTipi"/>
+    <w:link w:val="stBilgi"/>
+    <w:uiPriority w:val="99"/>
+    <w:rsid w:val="0047501F"/>
+  </w:style>
+  <w:style w:type="paragraph" w:styleId="AltBilgi">
+    <w:name w:val="footer"/>
+    <w:basedOn w:val="Normal"/>
+    <w:link w:val="AltBilgiChar"/>
+    <w:uiPriority w:val="99"/>
+    <w:unhideWhenUsed/>
+    <w:rsid w:val="0047501F"/>
+    <w:pPr>
+      <w:tabs>
+        <w:tab w:val="center" w:pos="4536"/>
+        <w:tab w:val="right" w:pos="9072"/>
+      </w:tabs>
+      <w:spacing w:after="0" w:line="240" w:lineRule="auto"/>
+    </w:pPr>
+  </w:style>
+  <w:style w:type="character" w:customStyle="1" w:styleId="AltBilgiChar">
+    <w:name w:val="Alt Bilgi Char"/>
+    <w:basedOn w:val="VarsaylanParagrafYazTipi"/>
+    <w:link w:val="AltBilgi"/>
+    <w:uiPriority w:val="99"/>
+    <w:rsid w:val="0047501F"/>
   </w:style>
 </w:styles>
 </file>

</xml_diff>

<commit_message>
#260211 fix: fixed global settings
</commit_message>
<xml_diff>
--- a/files/ihtar-ticari.docx
+++ b/files/ihtar-ticari.docx
@@ -420,39 +420,13 @@
         </w:rPr>
         <w:t xml:space="preserve">yine aşağıda yazılı </w:t>
       </w:r>
-      <w:proofErr w:type="spellStart"/>
-      <w:r>
-        <w:rPr>
-          <w:rFonts w:ascii="Times New Roman" w:hAnsi="Times New Roman" w:cs="Times New Roman"/>
-          <w:sz w:val="24"/>
-          <w:szCs w:val="24"/>
-        </w:rPr>
-        <w:t>maktuen</w:t>
-      </w:r>
-      <w:proofErr w:type="spellEnd"/>
-      <w:r>
-        <w:rPr>
-          <w:rFonts w:ascii="Times New Roman" w:hAnsi="Times New Roman" w:cs="Times New Roman"/>
-          <w:sz w:val="24"/>
-          <w:szCs w:val="24"/>
-        </w:rPr>
-        <w:t xml:space="preserve"> %</w:t>
-      </w:r>
-      <w:r>
-        <w:rPr>
-          <w:rFonts w:ascii="Times New Roman" w:hAnsi="Times New Roman" w:cs="Times New Roman"/>
-          <w:sz w:val="24"/>
-          <w:szCs w:val="24"/>
-        </w:rPr>
-        <w:t>15</w:t>
-      </w:r>
-      <w:r>
-        <w:rPr>
-          <w:rFonts w:ascii="Times New Roman" w:hAnsi="Times New Roman" w:cs="Times New Roman"/>
-          <w:sz w:val="24"/>
-          <w:szCs w:val="24"/>
-        </w:rPr>
-        <w:t xml:space="preserve"> takip tahsil giderini</w:t>
+      <w:r>
+        <w:rPr>
+          <w:rFonts w:ascii="Times New Roman" w:hAnsi="Times New Roman" w:cs="Times New Roman"/>
+          <w:sz w:val="24"/>
+          <w:szCs w:val="24"/>
+        </w:rPr>
+        <w:t>takip tahsil giderini</w:t>
       </w:r>
       <w:r>
         <w:rPr>
@@ -781,7 +755,7 @@
         <w:pStyle w:val="ListeParagraf"/>
         <w:numPr>
           <w:ilvl w:val="0"/>
-          <w:numId w:val="1"/>
+          <w:numId w:val="3"/>
         </w:numPr>
         <w:jc w:val="both"/>
         <w:rPr>
@@ -874,7 +848,7 @@
         <w:pStyle w:val="ListeParagraf"/>
         <w:numPr>
           <w:ilvl w:val="0"/>
-          <w:numId w:val="1"/>
+          <w:numId w:val="3"/>
         </w:numPr>
         <w:jc w:val="both"/>
         <w:rPr>
@@ -934,7 +908,7 @@
         <w:pStyle w:val="ListeParagraf"/>
         <w:numPr>
           <w:ilvl w:val="0"/>
-          <w:numId w:val="1"/>
+          <w:numId w:val="3"/>
         </w:numPr>
         <w:jc w:val="both"/>
         <w:rPr>
@@ -949,7 +923,15 @@
           <w:sz w:val="24"/>
           <w:szCs w:val="24"/>
         </w:rPr>
-        <w:t xml:space="preserve">%15 takip ve tahsil gideri </w:t>
+        <w:t>T</w:t>
+      </w:r>
+      <w:r>
+        <w:rPr>
+          <w:rFonts w:ascii="Times New Roman" w:hAnsi="Times New Roman" w:cs="Times New Roman"/>
+          <w:sz w:val="24"/>
+          <w:szCs w:val="24"/>
+        </w:rPr>
+        <w:t xml:space="preserve">akip ve tahsil gideri </w:t>
       </w:r>
       <w:r>
         <w:rPr>
@@ -992,10 +974,6 @@
     <w:p>
       <w:pPr>
         <w:pStyle w:val="ListeParagraf"/>
-        <w:numPr>
-          <w:ilvl w:val="0"/>
-          <w:numId w:val="1"/>
-        </w:numPr>
         <w:jc w:val="both"/>
         <w:rPr>
           <w:rFonts w:ascii="Times New Roman" w:hAnsi="Times New Roman" w:cs="Times New Roman"/>
@@ -1052,10 +1030,6 @@
     <w:p>
       <w:pPr>
         <w:pStyle w:val="ListeParagraf"/>
-        <w:numPr>
-          <w:ilvl w:val="0"/>
-          <w:numId w:val="1"/>
-        </w:numPr>
         <w:jc w:val="both"/>
         <w:rPr>
           <w:rFonts w:ascii="Times New Roman" w:hAnsi="Times New Roman" w:cs="Times New Roman"/>
@@ -1553,8 +1527,186 @@
       </w:rPr>
     </w:lvl>
   </w:abstractNum>
+  <w:abstractNum w:abstractNumId="1" w15:restartNumberingAfterBreak="0">
+    <w:nsid w:val="63A16878"/>
+    <w:multiLevelType w:val="hybridMultilevel"/>
+    <w:tmpl w:val="44641E9C"/>
+    <w:lvl w:ilvl="0" w:tplc="041F0017">
+      <w:start w:val="1"/>
+      <w:numFmt w:val="lowerLetter"/>
+      <w:lvlText w:val="%1)"/>
+      <w:lvlJc w:val="left"/>
+      <w:pPr>
+        <w:ind w:left="1080" w:hanging="360"/>
+      </w:pPr>
+    </w:lvl>
+    <w:lvl w:ilvl="1" w:tplc="041F0019" w:tentative="1">
+      <w:start w:val="1"/>
+      <w:numFmt w:val="lowerLetter"/>
+      <w:lvlText w:val="%2."/>
+      <w:lvlJc w:val="left"/>
+      <w:pPr>
+        <w:ind w:left="1800" w:hanging="360"/>
+      </w:pPr>
+    </w:lvl>
+    <w:lvl w:ilvl="2" w:tplc="041F001B" w:tentative="1">
+      <w:start w:val="1"/>
+      <w:numFmt w:val="lowerRoman"/>
+      <w:lvlText w:val="%3."/>
+      <w:lvlJc w:val="right"/>
+      <w:pPr>
+        <w:ind w:left="2520" w:hanging="180"/>
+      </w:pPr>
+    </w:lvl>
+    <w:lvl w:ilvl="3" w:tplc="041F000F" w:tentative="1">
+      <w:start w:val="1"/>
+      <w:numFmt w:val="decimal"/>
+      <w:lvlText w:val="%4."/>
+      <w:lvlJc w:val="left"/>
+      <w:pPr>
+        <w:ind w:left="3240" w:hanging="360"/>
+      </w:pPr>
+    </w:lvl>
+    <w:lvl w:ilvl="4" w:tplc="041F0019" w:tentative="1">
+      <w:start w:val="1"/>
+      <w:numFmt w:val="lowerLetter"/>
+      <w:lvlText w:val="%5."/>
+      <w:lvlJc w:val="left"/>
+      <w:pPr>
+        <w:ind w:left="3960" w:hanging="360"/>
+      </w:pPr>
+    </w:lvl>
+    <w:lvl w:ilvl="5" w:tplc="041F001B" w:tentative="1">
+      <w:start w:val="1"/>
+      <w:numFmt w:val="lowerRoman"/>
+      <w:lvlText w:val="%6."/>
+      <w:lvlJc w:val="right"/>
+      <w:pPr>
+        <w:ind w:left="4680" w:hanging="180"/>
+      </w:pPr>
+    </w:lvl>
+    <w:lvl w:ilvl="6" w:tplc="041F000F" w:tentative="1">
+      <w:start w:val="1"/>
+      <w:numFmt w:val="decimal"/>
+      <w:lvlText w:val="%7."/>
+      <w:lvlJc w:val="left"/>
+      <w:pPr>
+        <w:ind w:left="5400" w:hanging="360"/>
+      </w:pPr>
+    </w:lvl>
+    <w:lvl w:ilvl="7" w:tplc="041F0019" w:tentative="1">
+      <w:start w:val="1"/>
+      <w:numFmt w:val="lowerLetter"/>
+      <w:lvlText w:val="%8."/>
+      <w:lvlJc w:val="left"/>
+      <w:pPr>
+        <w:ind w:left="6120" w:hanging="360"/>
+      </w:pPr>
+    </w:lvl>
+    <w:lvl w:ilvl="8" w:tplc="041F001B" w:tentative="1">
+      <w:start w:val="1"/>
+      <w:numFmt w:val="lowerRoman"/>
+      <w:lvlText w:val="%9."/>
+      <w:lvlJc w:val="right"/>
+      <w:pPr>
+        <w:ind w:left="6840" w:hanging="180"/>
+      </w:pPr>
+    </w:lvl>
+  </w:abstractNum>
+  <w:abstractNum w:abstractNumId="2" w15:restartNumberingAfterBreak="0">
+    <w:nsid w:val="65C500C4"/>
+    <w:multiLevelType w:val="hybridMultilevel"/>
+    <w:tmpl w:val="26D28D14"/>
+    <w:lvl w:ilvl="0" w:tplc="041F0017">
+      <w:start w:val="1"/>
+      <w:numFmt w:val="lowerLetter"/>
+      <w:lvlText w:val="%1)"/>
+      <w:lvlJc w:val="left"/>
+      <w:pPr>
+        <w:ind w:left="720" w:hanging="360"/>
+      </w:pPr>
+    </w:lvl>
+    <w:lvl w:ilvl="1" w:tplc="041F0019" w:tentative="1">
+      <w:start w:val="1"/>
+      <w:numFmt w:val="lowerLetter"/>
+      <w:lvlText w:val="%2."/>
+      <w:lvlJc w:val="left"/>
+      <w:pPr>
+        <w:ind w:left="1440" w:hanging="360"/>
+      </w:pPr>
+    </w:lvl>
+    <w:lvl w:ilvl="2" w:tplc="041F001B" w:tentative="1">
+      <w:start w:val="1"/>
+      <w:numFmt w:val="lowerRoman"/>
+      <w:lvlText w:val="%3."/>
+      <w:lvlJc w:val="right"/>
+      <w:pPr>
+        <w:ind w:left="2160" w:hanging="180"/>
+      </w:pPr>
+    </w:lvl>
+    <w:lvl w:ilvl="3" w:tplc="041F000F" w:tentative="1">
+      <w:start w:val="1"/>
+      <w:numFmt w:val="decimal"/>
+      <w:lvlText w:val="%4."/>
+      <w:lvlJc w:val="left"/>
+      <w:pPr>
+        <w:ind w:left="2880" w:hanging="360"/>
+      </w:pPr>
+    </w:lvl>
+    <w:lvl w:ilvl="4" w:tplc="041F0019" w:tentative="1">
+      <w:start w:val="1"/>
+      <w:numFmt w:val="lowerLetter"/>
+      <w:lvlText w:val="%5."/>
+      <w:lvlJc w:val="left"/>
+      <w:pPr>
+        <w:ind w:left="3600" w:hanging="360"/>
+      </w:pPr>
+    </w:lvl>
+    <w:lvl w:ilvl="5" w:tplc="041F001B" w:tentative="1">
+      <w:start w:val="1"/>
+      <w:numFmt w:val="lowerRoman"/>
+      <w:lvlText w:val="%6."/>
+      <w:lvlJc w:val="right"/>
+      <w:pPr>
+        <w:ind w:left="4320" w:hanging="180"/>
+      </w:pPr>
+    </w:lvl>
+    <w:lvl w:ilvl="6" w:tplc="041F000F" w:tentative="1">
+      <w:start w:val="1"/>
+      <w:numFmt w:val="decimal"/>
+      <w:lvlText w:val="%7."/>
+      <w:lvlJc w:val="left"/>
+      <w:pPr>
+        <w:ind w:left="5040" w:hanging="360"/>
+      </w:pPr>
+    </w:lvl>
+    <w:lvl w:ilvl="7" w:tplc="041F0019" w:tentative="1">
+      <w:start w:val="1"/>
+      <w:numFmt w:val="lowerLetter"/>
+      <w:lvlText w:val="%8."/>
+      <w:lvlJc w:val="left"/>
+      <w:pPr>
+        <w:ind w:left="5760" w:hanging="360"/>
+      </w:pPr>
+    </w:lvl>
+    <w:lvl w:ilvl="8" w:tplc="041F001B" w:tentative="1">
+      <w:start w:val="1"/>
+      <w:numFmt w:val="lowerRoman"/>
+      <w:lvlText w:val="%9."/>
+      <w:lvlJc w:val="right"/>
+      <w:pPr>
+        <w:ind w:left="6480" w:hanging="180"/>
+      </w:pPr>
+    </w:lvl>
+  </w:abstractNum>
   <w:num w:numId="1" w16cid:durableId="1701785724">
     <w:abstractNumId w:val="0"/>
+  </w:num>
+  <w:num w:numId="2" w16cid:durableId="452021131">
+    <w:abstractNumId w:val="1"/>
+  </w:num>
+  <w:num w:numId="3" w16cid:durableId="228080762">
+    <w:abstractNumId w:val="2"/>
   </w:num>
 </w:numbering>
 </file>

</xml_diff>

<commit_message>
#260226 fix: fixed global settings
</commit_message>
<xml_diff>
--- a/files/ihtar-ticari.docx
+++ b/files/ihtar-ticari.docx
@@ -669,11 +669,92 @@
       <w:r>
         <w:rPr>
           <w:rFonts w:ascii="Times New Roman" w:hAnsi="Times New Roman" w:cs="Times New Roman"/>
+          <w:noProof/>
+          <w:sz w:val="24"/>
+          <w:szCs w:val="24"/>
+        </w:rPr>
+        <w:drawing>
+          <wp:anchor distT="0" distB="0" distL="114300" distR="114300" simplePos="0" relativeHeight="251658240" behindDoc="0" locked="0" layoutInCell="1" allowOverlap="1" wp14:anchorId="0A21A501" wp14:editId="71E777EF">
+            <wp:simplePos x="0" y="0"/>
+            <wp:positionH relativeFrom="margin">
+              <wp:posOffset>3646170</wp:posOffset>
+            </wp:positionH>
+            <wp:positionV relativeFrom="paragraph">
+              <wp:posOffset>258445</wp:posOffset>
+            </wp:positionV>
+            <wp:extent cx="2032635" cy="720725"/>
+            <wp:effectExtent l="0" t="0" r="5715" b="3175"/>
+            <wp:wrapThrough wrapText="bothSides">
+              <wp:wrapPolygon edited="0">
+                <wp:start x="0" y="0"/>
+                <wp:lineTo x="0" y="21124"/>
+                <wp:lineTo x="21458" y="21124"/>
+                <wp:lineTo x="21458" y="0"/>
+                <wp:lineTo x="0" y="0"/>
+              </wp:wrapPolygon>
+            </wp:wrapThrough>
+            <wp:docPr id="774955957" name="Resim 1" descr="metin, yazı tipi, kılavuz içeren bir resim&#10;&#10;Yapay zeka tarafından oluşturulmuş içerik yanlış olabilir."/>
+            <wp:cNvGraphicFramePr>
+              <a:graphicFrameLocks xmlns:a="http://schemas.openxmlformats.org/drawingml/2006/main" noChangeAspect="1"/>
+            </wp:cNvGraphicFramePr>
+            <a:graphic xmlns:a="http://schemas.openxmlformats.org/drawingml/2006/main">
+              <a:graphicData uri="http://schemas.openxmlformats.org/drawingml/2006/picture">
+                <pic:pic xmlns:pic="http://schemas.openxmlformats.org/drawingml/2006/picture">
+                  <pic:nvPicPr>
+                    <pic:cNvPr id="774955957" name="Resim 1" descr="metin, yazı tipi, kılavuz içeren bir resim&#10;&#10;Yapay zeka tarafından oluşturulmuş içerik yanlış olabilir."/>
+                    <pic:cNvPicPr/>
+                  </pic:nvPicPr>
+                  <pic:blipFill>
+                    <a:blip r:embed="rId7">
+                      <a:extLst>
+                        <a:ext uri="{28A0092B-C50C-407E-A947-70E740481C1C}">
+                          <a14:useLocalDpi xmlns:a14="http://schemas.microsoft.com/office/drawing/2010/main" val="0"/>
+                        </a:ext>
+                      </a:extLst>
+                    </a:blip>
+                    <a:stretch>
+                      <a:fillRect/>
+                    </a:stretch>
+                  </pic:blipFill>
+                  <pic:spPr>
+                    <a:xfrm>
+                      <a:off x="0" y="0"/>
+                      <a:ext cx="2032635" cy="720725"/>
+                    </a:xfrm>
+                    <a:prstGeom prst="rect">
+                      <a:avLst/>
+                    </a:prstGeom>
+                  </pic:spPr>
+                </pic:pic>
+              </a:graphicData>
+            </a:graphic>
+            <wp14:sizeRelH relativeFrom="page">
+              <wp14:pctWidth>0</wp14:pctWidth>
+            </wp14:sizeRelH>
+            <wp14:sizeRelV relativeFrom="page">
+              <wp14:pctHeight>0</wp14:pctHeight>
+            </wp14:sizeRelV>
+          </wp:anchor>
+        </w:drawing>
+      </w:r>
+      <w:r>
+        <w:rPr>
+          <w:rFonts w:ascii="Times New Roman" w:hAnsi="Times New Roman" w:cs="Times New Roman"/>
           <w:sz w:val="24"/>
           <w:szCs w:val="24"/>
         </w:rPr>
         <w:t>ARI FİNANSAL KİRALAMA A.Ş.</w:t>
       </w:r>
+    </w:p>
+    <w:p>
+      <w:pPr>
+        <w:jc w:val="right"/>
+        <w:rPr>
+          <w:rFonts w:ascii="Times New Roman" w:hAnsi="Times New Roman" w:cs="Times New Roman"/>
+          <w:sz w:val="24"/>
+          <w:szCs w:val="24"/>
+        </w:rPr>
+      </w:pPr>
     </w:p>
     <w:p>
       <w:pPr>
@@ -1175,8 +1256,8 @@
       </w:r>
     </w:p>
     <w:sectPr>
-      <w:headerReference w:type="default" r:id="rId7"/>
-      <w:footerReference w:type="default" r:id="rId8"/>
+      <w:headerReference w:type="default" r:id="rId8"/>
+      <w:footerReference w:type="default" r:id="rId9"/>
       <w:pgSz w:w="11906" w:h="16838"/>
       <w:pgMar w:top="1417" w:right="1417" w:bottom="1417" w:left="1417" w:header="708" w:footer="708" w:gutter="0"/>
       <w:cols w:space="708"/>

</xml_diff>